<commit_message>
feat: Cap nhat Hotline 0918939942 va Nam hoc 2026-2027 toan bo he thong & bao cao
</commit_message>
<xml_diff>
--- a/BAOCAOCHITIET.docx
+++ b/BAOCAOCHITIET.docx
@@ -207,28 +207,25 @@
           <w:sz w:val="28"/>
           <w:szCs w:val="28"/>
         </w:rPr>
-        <w:t>Cần Thơ, năm học 2025 – 2026</w:t>
-      </w:r>
-    </w:p>
-    <w:p>
-      <w:pPr>
-        <w:pageBreakBefore/>
-        <w:spacing w:line="276" w:lineRule="auto"/>
-        <w:contextualSpacing/>
-        <w:rPr>
-          <w:rFonts w:asciiTheme="majorHAnsi" w:hAnsiTheme="majorHAnsi" w:cstheme="majorHAnsi"/>
-          <w:sz w:val="28"/>
-          <w:szCs w:val="28"/>
-        </w:rPr>
-      </w:pPr>
-      <w:r>
-        <w:rPr>
-          <w:rFonts w:asciiTheme="majorHAnsi" w:hAnsiTheme="majorHAnsi" w:cstheme="majorHAnsi"/>
-          <w:sz w:val="28"/>
-          <w:szCs w:val="28"/>
-        </w:rPr>
-        <w:lastRenderedPageBreak/>
-        <w:br/>
+        <w:t>Cần Thơ, năm học 2026 – 2027</w:t>
+      </w:r>
+    </w:p>
+    <w:p>
+      <w:pPr>
+        <w:rPr>
+          <w:rFonts w:asciiTheme="majorHAnsi" w:hAnsiTheme="majorHAnsi" w:cstheme="majorHAnsi"/>
+          <w:b/>
+          <w:bCs/>
+          <w:color w:val="1F4E79"/>
+          <w:sz w:val="28"/>
+          <w:szCs w:val="28"/>
+        </w:rPr>
+      </w:pPr>
+      <w:r>
+        <w:rPr>
+          <w:rFonts w:asciiTheme="majorHAnsi" w:hAnsiTheme="majorHAnsi" w:cstheme="majorHAnsi"/>
+        </w:rPr>
+        <w:br w:type="page"/>
       </w:r>
     </w:p>
     <w:p>
@@ -244,22 +241,9 @@
         <w:rPr>
           <w:rFonts w:asciiTheme="majorHAnsi" w:hAnsiTheme="majorHAnsi" w:cstheme="majorHAnsi"/>
         </w:rPr>
+        <w:lastRenderedPageBreak/>
         <w:t>PHẦN I. MỞ ĐẦU</w:t>
       </w:r>
-    </w:p>
-    <w:p>
-      <w:pPr>
-        <w:pBdr>
-          <w:bottom w:val="single" w:sz="6" w:space="1" w:color="2E74B5"/>
-        </w:pBdr>
-        <w:spacing w:line="276" w:lineRule="auto"/>
-        <w:contextualSpacing/>
-        <w:rPr>
-          <w:rFonts w:asciiTheme="majorHAnsi" w:hAnsiTheme="majorHAnsi" w:cstheme="majorHAnsi"/>
-          <w:sz w:val="28"/>
-          <w:szCs w:val="28"/>
-        </w:rPr>
-      </w:pPr>
     </w:p>
     <w:p>
       <w:pPr>
@@ -301,6 +285,18 @@
         </w:rPr>
         <w:t>Trong công tác quản lý thư viện trường học, việc theo dõi mượn trả sách, thiết bị dạy học là nhiệm vụ thường xuyên nhưng đòi hỏi nhiều thao tác thủ công. Sổ sách giấy truyền thống dễ thất lạc, khó tra cứu và không thể chia sẻ thông tin giữa nhiều người dùng.</w:t>
       </w:r>
+    </w:p>
+    <w:p>
+      <w:pPr>
+        <w:spacing w:line="276" w:lineRule="auto"/>
+        <w:contextualSpacing/>
+        <w:jc w:val="both"/>
+        <w:rPr>
+          <w:rFonts w:asciiTheme="majorHAnsi" w:hAnsiTheme="majorHAnsi" w:cstheme="majorHAnsi"/>
+          <w:sz w:val="28"/>
+          <w:szCs w:val="28"/>
+        </w:rPr>
+      </w:pPr>
       <w:r>
         <w:rPr>
           <w:rFonts w:asciiTheme="majorHAnsi" w:hAnsiTheme="majorHAnsi" w:cstheme="majorHAnsi"/>
@@ -308,6 +304,7 @@
           <w:sz w:val="28"/>
           <w:szCs w:val="28"/>
         </w:rPr>
+        <w:t>Thực tế quản lý thư viện cho thấy, khi thủ thư phải ghi chép bằng tay, tra cứu sổ mượn giấy, các em học sinh phải chờ đợi lâu, dữ liệu dễ sai sót và không thể truy cập từ xa. Điều này ảnh hưởng đến hiệu quả phục vụ bạn đọc.</w:t>
       </w:r>
     </w:p>
     <w:p>
@@ -328,56 +325,8 @@
           <w:sz w:val="28"/>
           <w:szCs w:val="28"/>
         </w:rPr>
-        <w:t>Thực tế quản lý thư viện cho thấy, khi thủ thư phải ghi chép bằng tay, tra cứu sổ mượn giấy, các em học sinh phải chờ đợi lâu, dữ liệu dễ sai sót và không thể truy cập từ xa. Điều này ảnh hưởng đến hiệu quả phục vụ bạn đọc.</w:t>
-      </w:r>
-      <w:r>
-        <w:rPr>
-          <w:rFonts w:asciiTheme="majorHAnsi" w:hAnsiTheme="majorHAnsi" w:cstheme="majorHAnsi"/>
-          <w:color w:val="000000"/>
-          <w:sz w:val="28"/>
-          <w:szCs w:val="28"/>
-        </w:rPr>
-      </w:r>
-    </w:p>
-    <w:p>
-      <w:pPr>
-        <w:spacing w:line="276" w:lineRule="auto"/>
-        <w:contextualSpacing/>
-        <w:jc w:val="both"/>
-        <w:rPr>
-          <w:rFonts w:asciiTheme="majorHAnsi" w:hAnsiTheme="majorHAnsi" w:cstheme="majorHAnsi"/>
-          <w:sz w:val="28"/>
-          <w:szCs w:val="28"/>
-        </w:rPr>
-      </w:pPr>
-      <w:r>
-        <w:rPr>
-          <w:rFonts w:asciiTheme="majorHAnsi" w:hAnsiTheme="majorHAnsi" w:cstheme="majorHAnsi"/>
-          <w:color w:val="000000"/>
-          <w:sz w:val="28"/>
-          <w:szCs w:val="28"/>
-        </w:rPr>
         <w:t>Xuất phát từ nhu cầu thực tế đó, sản phẩm "Thư Viện Số THPT Hoàng Diệu" được xây dựng nhằm tạo ra một hệ thống quản lý thư viện trực tuyến, hiện đại — giúp thủ thư và bạn đọc dễ dàng tra cứu tài nguyên, đăng ký mượn online, theo dõi trạng thái phiếu mượn thời gian thực.</w:t>
       </w:r>
-      <w:r>
-        <w:rPr>
-          <w:rFonts w:asciiTheme="majorHAnsi" w:hAnsiTheme="majorHAnsi" w:cstheme="majorHAnsi"/>
-          <w:color w:val="000000"/>
-          <w:sz w:val="28"/>
-          <w:szCs w:val="28"/>
-        </w:rPr>
-      </w:r>
-    </w:p>
-    <w:p>
-      <w:pPr>
-        <w:spacing w:line="276" w:lineRule="auto"/>
-        <w:contextualSpacing/>
-        <w:rPr>
-          <w:rFonts w:asciiTheme="majorHAnsi" w:hAnsiTheme="majorHAnsi" w:cstheme="majorHAnsi"/>
-          <w:sz w:val="28"/>
-          <w:szCs w:val="28"/>
-        </w:rPr>
-      </w:pPr>
     </w:p>
     <w:p>
       <w:pPr>
@@ -491,13 +440,6 @@
         </w:rPr>
         <w:t>Đồng bộ dữ liệu thời gian thực giữa bạn đọc và thủ thư qua Firebase Firestore.</w:t>
       </w:r>
-      <w:r>
-        <w:rPr>
-          <w:rFonts w:asciiTheme="majorHAnsi" w:hAnsiTheme="majorHAnsi" w:cstheme="majorHAnsi"/>
-          <w:sz w:val="28"/>
-          <w:szCs w:val="28"/>
-        </w:rPr>
-      </w:r>
     </w:p>
     <w:p>
       <w:pPr>
@@ -549,17 +491,6 @@
     </w:p>
     <w:p>
       <w:pPr>
-        <w:spacing w:line="276" w:lineRule="auto"/>
-        <w:contextualSpacing/>
-        <w:rPr>
-          <w:rFonts w:asciiTheme="majorHAnsi" w:hAnsiTheme="majorHAnsi" w:cstheme="majorHAnsi"/>
-          <w:sz w:val="28"/>
-          <w:szCs w:val="28"/>
-        </w:rPr>
-      </w:pPr>
-    </w:p>
-    <w:p>
-      <w:pPr>
         <w:pStyle w:val="Heading2"/>
         <w:spacing w:before="0" w:after="0" w:line="276" w:lineRule="auto"/>
         <w:contextualSpacing/>
@@ -600,6 +531,81 @@
         </w:rPr>
         <w:t>- Đối tượng nghiên cứu:</w:t>
       </w:r>
+    </w:p>
+    <w:p>
+      <w:pPr>
+        <w:spacing w:line="276" w:lineRule="auto"/>
+        <w:contextualSpacing/>
+        <w:jc w:val="both"/>
+        <w:rPr>
+          <w:rFonts w:asciiTheme="majorHAnsi" w:hAnsiTheme="majorHAnsi" w:cstheme="majorHAnsi"/>
+          <w:sz w:val="28"/>
+          <w:szCs w:val="28"/>
+        </w:rPr>
+      </w:pPr>
+      <w:r>
+        <w:rPr>
+          <w:rFonts w:asciiTheme="majorHAnsi" w:hAnsiTheme="majorHAnsi" w:cstheme="majorHAnsi"/>
+          <w:color w:val="000000"/>
+          <w:sz w:val="28"/>
+          <w:szCs w:val="28"/>
+        </w:rPr>
+        <w:t>+ Học sinh và giáo viên THPT — bạn đọc thư viện trường.</w:t>
+      </w:r>
+    </w:p>
+    <w:p>
+      <w:pPr>
+        <w:spacing w:line="276" w:lineRule="auto"/>
+        <w:contextualSpacing/>
+        <w:jc w:val="both"/>
+        <w:rPr>
+          <w:rFonts w:asciiTheme="majorHAnsi" w:hAnsiTheme="majorHAnsi" w:cstheme="majorHAnsi"/>
+          <w:sz w:val="28"/>
+          <w:szCs w:val="28"/>
+        </w:rPr>
+      </w:pPr>
+      <w:r>
+        <w:rPr>
+          <w:rFonts w:asciiTheme="majorHAnsi" w:hAnsiTheme="majorHAnsi" w:cstheme="majorHAnsi"/>
+          <w:color w:val="000000"/>
+          <w:sz w:val="28"/>
+          <w:szCs w:val="28"/>
+        </w:rPr>
+        <w:t>+ Cán bộ thủ thư — người quản trị hệ thống thư viện.</w:t>
+      </w:r>
+    </w:p>
+    <w:p>
+      <w:pPr>
+        <w:spacing w:line="276" w:lineRule="auto"/>
+        <w:contextualSpacing/>
+        <w:jc w:val="both"/>
+        <w:rPr>
+          <w:rFonts w:asciiTheme="majorHAnsi" w:hAnsiTheme="majorHAnsi" w:cstheme="majorHAnsi"/>
+          <w:sz w:val="28"/>
+          <w:szCs w:val="28"/>
+        </w:rPr>
+      </w:pPr>
+      <w:r>
+        <w:rPr>
+          <w:rFonts w:asciiTheme="majorHAnsi" w:hAnsiTheme="majorHAnsi" w:cstheme="majorHAnsi"/>
+          <w:color w:val="000000"/>
+          <w:sz w:val="28"/>
+          <w:szCs w:val="28"/>
+        </w:rPr>
+        <w:t>+ Quy trình mượn trả sách, thiết bị dạy học tại thư viện trường học.</w:t>
+      </w:r>
+    </w:p>
+    <w:p>
+      <w:pPr>
+        <w:spacing w:line="276" w:lineRule="auto"/>
+        <w:contextualSpacing/>
+        <w:jc w:val="both"/>
+        <w:rPr>
+          <w:rFonts w:asciiTheme="majorHAnsi" w:hAnsiTheme="majorHAnsi" w:cstheme="majorHAnsi"/>
+          <w:sz w:val="28"/>
+          <w:szCs w:val="28"/>
+        </w:rPr>
+      </w:pPr>
       <w:r>
         <w:rPr>
           <w:rFonts w:asciiTheme="majorHAnsi" w:hAnsiTheme="majorHAnsi" w:cstheme="majorHAnsi"/>
@@ -609,6 +615,7 @@
           <w:sz w:val="28"/>
           <w:szCs w:val="28"/>
         </w:rPr>
+        <w:t>- Phạm vi nghiên cứu:</w:t>
       </w:r>
     </w:p>
     <w:p>
@@ -629,7 +636,7 @@
           <w:sz w:val="28"/>
           <w:szCs w:val="28"/>
         </w:rPr>
-        <w:t>+ Học sinh và giáo viên THPT — bạn đọc thư viện trường.</w:t>
+        <w:t>+ Ứng dụng web React 19 + Vite 8, sử dụng Firebase Authentication và Firestore.</w:t>
       </w:r>
     </w:p>
     <w:p>
@@ -650,7 +657,7 @@
           <w:sz w:val="28"/>
           <w:szCs w:val="28"/>
         </w:rPr>
-        <w:t>+ Cán bộ thủ thư — người quản trị hệ thống thư viện.</w:t>
+        <w:t>+ Quản lý tài nguyên thư viện: sách giáo khoa, sách tham khảo, thiết bị dạy học.</w:t>
       </w:r>
     </w:p>
     <w:p>
@@ -671,115 +678,8 @@
           <w:sz w:val="28"/>
           <w:szCs w:val="28"/>
         </w:rPr>
-        <w:t>+ Quy trình mượn trả sách, thiết bị dạy học tại thư viện trường học.</w:t>
-      </w:r>
-    </w:p>
-    <w:p>
-      <w:pPr>
-        <w:spacing w:line="276" w:lineRule="auto"/>
-        <w:contextualSpacing/>
-        <w:jc w:val="both"/>
-        <w:rPr>
-          <w:rFonts w:asciiTheme="majorHAnsi" w:hAnsiTheme="majorHAnsi" w:cstheme="majorHAnsi"/>
-          <w:sz w:val="28"/>
-          <w:szCs w:val="28"/>
-        </w:rPr>
-      </w:pPr>
-      <w:r>
-        <w:rPr>
-          <w:rFonts w:asciiTheme="majorHAnsi" w:hAnsiTheme="majorHAnsi" w:cstheme="majorHAnsi"/>
-          <w:b/>
-          <w:bCs/>
-          <w:color w:val="000000"/>
-          <w:sz w:val="28"/>
-          <w:szCs w:val="28"/>
-        </w:rPr>
-        <w:t>- Phạm vi nghiên cứu:</w:t>
-      </w:r>
-      <w:r>
-        <w:rPr>
-          <w:rFonts w:asciiTheme="majorHAnsi" w:hAnsiTheme="majorHAnsi" w:cstheme="majorHAnsi"/>
-          <w:b/>
-          <w:bCs/>
-          <w:color w:val="000000"/>
-          <w:sz w:val="28"/>
-          <w:szCs w:val="28"/>
-        </w:rPr>
-      </w:r>
-    </w:p>
-    <w:p>
-      <w:pPr>
-        <w:spacing w:line="276" w:lineRule="auto"/>
-        <w:contextualSpacing/>
-        <w:jc w:val="both"/>
-        <w:rPr>
-          <w:rFonts w:asciiTheme="majorHAnsi" w:hAnsiTheme="majorHAnsi" w:cstheme="majorHAnsi"/>
-          <w:sz w:val="28"/>
-          <w:szCs w:val="28"/>
-        </w:rPr>
-      </w:pPr>
-      <w:r>
-        <w:rPr>
-          <w:rFonts w:asciiTheme="majorHAnsi" w:hAnsiTheme="majorHAnsi" w:cstheme="majorHAnsi"/>
-          <w:color w:val="000000"/>
-          <w:sz w:val="28"/>
-          <w:szCs w:val="28"/>
-        </w:rPr>
-        <w:t>+ Ứng dụng web React 19 + Vite 8, sử dụng Firebase Authentication và Firestore.</w:t>
-      </w:r>
-    </w:p>
-    <w:p>
-      <w:pPr>
-        <w:spacing w:line="276" w:lineRule="auto"/>
-        <w:contextualSpacing/>
-        <w:jc w:val="both"/>
-        <w:rPr>
-          <w:rFonts w:asciiTheme="majorHAnsi" w:hAnsiTheme="majorHAnsi" w:cstheme="majorHAnsi"/>
-          <w:sz w:val="28"/>
-          <w:szCs w:val="28"/>
-        </w:rPr>
-      </w:pPr>
-      <w:r>
-        <w:rPr>
-          <w:rFonts w:asciiTheme="majorHAnsi" w:hAnsiTheme="majorHAnsi" w:cstheme="majorHAnsi"/>
-          <w:color w:val="000000"/>
-          <w:sz w:val="28"/>
-          <w:szCs w:val="28"/>
-        </w:rPr>
-        <w:t>+ Quản lý tài nguyên thư viện: sách giáo khoa, sách tham khảo, thiết bị dạy học.</w:t>
-      </w:r>
-    </w:p>
-    <w:p>
-      <w:pPr>
-        <w:spacing w:line="276" w:lineRule="auto"/>
-        <w:contextualSpacing/>
-        <w:jc w:val="both"/>
-        <w:rPr>
-          <w:rFonts w:asciiTheme="majorHAnsi" w:hAnsiTheme="majorHAnsi" w:cstheme="majorHAnsi"/>
-          <w:sz w:val="28"/>
-          <w:szCs w:val="28"/>
-        </w:rPr>
-      </w:pPr>
-      <w:r>
-        <w:rPr>
-          <w:rFonts w:asciiTheme="majorHAnsi" w:hAnsiTheme="majorHAnsi" w:cstheme="majorHAnsi"/>
-          <w:color w:val="000000"/>
-          <w:sz w:val="28"/>
-          <w:szCs w:val="28"/>
-        </w:rPr>
         <w:t>+ Triển khai trên Vercel tại https://thuviensothpthoangdieu.vercel.app/, mã nguồn GitHub.</w:t>
       </w:r>
-    </w:p>
-    <w:p>
-      <w:pPr>
-        <w:spacing w:line="276" w:lineRule="auto"/>
-        <w:contextualSpacing/>
-        <w:rPr>
-          <w:rFonts w:asciiTheme="majorHAnsi" w:hAnsiTheme="majorHAnsi" w:cstheme="majorHAnsi"/>
-          <w:sz w:val="28"/>
-          <w:szCs w:val="28"/>
-        </w:rPr>
-      </w:pPr>
     </w:p>
     <w:p>
       <w:pPr>
@@ -822,14 +722,8 @@
           <w:sz w:val="28"/>
           <w:szCs w:val="28"/>
         </w:rPr>
+        <w:lastRenderedPageBreak/>
         <w:t>Hệ thống sẽ giúp giảm ít nhất 70% thời gian tra cứu và xử lý phiếu mượn so với sổ sách giấy truyền thống.</w:t>
-      </w:r>
-      <w:r>
-        <w:rPr>
-          <w:rFonts w:asciiTheme="majorHAnsi" w:hAnsiTheme="majorHAnsi" w:cstheme="majorHAnsi"/>
-          <w:sz w:val="28"/>
-          <w:szCs w:val="28"/>
-        </w:rPr>
       </w:r>
     </w:p>
     <w:p>
@@ -879,24 +773,6 @@
         </w:rPr>
         <w:t>Giao diện hiện đại, thân thiện giúp tăng mức độ sử dụng thư viện của học sinh.</w:t>
       </w:r>
-      <w:r>
-        <w:rPr>
-          <w:rFonts w:asciiTheme="majorHAnsi" w:hAnsiTheme="majorHAnsi" w:cstheme="majorHAnsi"/>
-          <w:sz w:val="28"/>
-          <w:szCs w:val="28"/>
-        </w:rPr>
-      </w:r>
-    </w:p>
-    <w:p>
-      <w:pPr>
-        <w:spacing w:line="276" w:lineRule="auto"/>
-        <w:contextualSpacing/>
-        <w:rPr>
-          <w:rFonts w:asciiTheme="majorHAnsi" w:hAnsiTheme="majorHAnsi" w:cstheme="majorHAnsi"/>
-          <w:sz w:val="28"/>
-          <w:szCs w:val="28"/>
-        </w:rPr>
-      </w:pPr>
     </w:p>
     <w:p>
       <w:pPr>
@@ -1009,18 +885,7 @@
           <w:sz w:val="28"/>
           <w:szCs w:val="28"/>
         </w:rPr>
-        <w:t>Ý nghĩ</w:t>
-      </w:r>
-      <w:r>
-        <w:rPr>
-          <w:rFonts w:asciiTheme="majorHAnsi" w:hAnsiTheme="majorHAnsi" w:cstheme="majorHAnsi"/>
-          <w:b/>
-          <w:bCs/>
-          <w:color w:val="000000"/>
-          <w:sz w:val="28"/>
-          <w:szCs w:val="28"/>
-        </w:rPr>
-        <w:t>a thực tiễn:</w:t>
+        <w:t>Ý nghĩa thực tiễn:</w:t>
       </w:r>
     </w:p>
     <w:p>
@@ -1094,13 +959,6 @@
         </w:rPr>
         <w:t>Không cần cài đặt phần mềm, không cần máy chủ riêng — hoàn toàn miễn phí với Firebase free tier.</w:t>
       </w:r>
-      <w:r>
-        <w:rPr>
-          <w:rFonts w:asciiTheme="majorHAnsi" w:hAnsiTheme="majorHAnsi" w:cstheme="majorHAnsi"/>
-          <w:sz w:val="28"/>
-          <w:szCs w:val="28"/>
-        </w:rPr>
-      </w:r>
     </w:p>
     <w:p>
       <w:pPr>
@@ -1128,17 +986,6 @@
     </w:p>
     <w:p>
       <w:pPr>
-        <w:spacing w:line="276" w:lineRule="auto"/>
-        <w:contextualSpacing/>
-        <w:rPr>
-          <w:rFonts w:asciiTheme="majorHAnsi" w:hAnsiTheme="majorHAnsi" w:cstheme="majorHAnsi"/>
-          <w:sz w:val="28"/>
-          <w:szCs w:val="28"/>
-        </w:rPr>
-      </w:pPr>
-    </w:p>
-    <w:p>
-      <w:pPr>
         <w:pStyle w:val="Heading2"/>
         <w:spacing w:before="0" w:after="0" w:line="276" w:lineRule="auto"/>
         <w:contextualSpacing/>
@@ -1175,29 +1022,11 @@
       <w:r>
         <w:rPr>
           <w:rFonts w:asciiTheme="majorHAnsi" w:hAnsiTheme="majorHAnsi" w:cstheme="majorHAnsi"/>
-          <w:b/>
-          <w:bCs/>
           <w:color w:val="000000"/>
           <w:sz w:val="28"/>
           <w:szCs w:val="28"/>
         </w:rPr>
         <w:t>Đồng bộ thời gian thực (Real-time Sync): Sử dụng Firebase Firestore onSnapshot() — khi bạn đọc gửi yêu cầu mượn, thủ thư thấy ngay trên màn hình mà không cần reload trang.</w:t>
-      </w:r>
-      <w:r>
-        <w:rPr>
-          <w:rFonts w:asciiTheme="majorHAnsi" w:hAnsiTheme="majorHAnsi" w:cstheme="majorHAnsi"/>
-          <w:color w:val="000000"/>
-          <w:sz w:val="28"/>
-          <w:szCs w:val="28"/>
-        </w:rPr>
-      </w:r>
-      <w:r>
-        <w:rPr>
-          <w:rFonts w:asciiTheme="majorHAnsi" w:hAnsiTheme="majorHAnsi" w:cstheme="majorHAnsi"/>
-          <w:color w:val="000000"/>
-          <w:sz w:val="28"/>
-          <w:szCs w:val="28"/>
-        </w:rPr>
       </w:r>
     </w:p>
     <w:p>
@@ -1218,21 +1047,11 @@
       <w:r>
         <w:rPr>
           <w:rFonts w:asciiTheme="majorHAnsi" w:hAnsiTheme="majorHAnsi" w:cstheme="majorHAnsi"/>
-          <w:b/>
-          <w:bCs/>
           <w:color w:val="000000"/>
           <w:sz w:val="28"/>
           <w:szCs w:val="28"/>
         </w:rPr>
         <w:t>Phân quyền tự động: Hệ thống tự nhận diện email thủ thư và nâng quyền librarian, không cần can thiệp thủ công vào database.</w:t>
-      </w:r>
-      <w:r>
-        <w:rPr>
-          <w:rFonts w:asciiTheme="majorHAnsi" w:hAnsiTheme="majorHAnsi" w:cstheme="majorHAnsi"/>
-          <w:color w:val="000000"/>
-          <w:sz w:val="28"/>
-          <w:szCs w:val="28"/>
-        </w:rPr>
       </w:r>
     </w:p>
     <w:p>
@@ -1253,29 +1072,11 @@
       <w:r>
         <w:rPr>
           <w:rFonts w:asciiTheme="majorHAnsi" w:hAnsiTheme="majorHAnsi" w:cstheme="majorHAnsi"/>
-          <w:b/>
-          <w:bCs/>
           <w:color w:val="000000"/>
           <w:sz w:val="28"/>
           <w:szCs w:val="28"/>
         </w:rPr>
         <w:t>5 module chức năng trong 1 app: Danh mục tài nguyên, Phiếu mượn, Dashboard thống kê, Quản trị kho (Admin), và Giới thiệu.</w:t>
-      </w:r>
-      <w:r>
-        <w:rPr>
-          <w:rFonts w:asciiTheme="majorHAnsi" w:hAnsiTheme="majorHAnsi" w:cstheme="majorHAnsi"/>
-          <w:color w:val="000000"/>
-          <w:sz w:val="28"/>
-          <w:szCs w:val="28"/>
-        </w:rPr>
-      </w:r>
-      <w:r>
-        <w:rPr>
-          <w:rFonts w:asciiTheme="majorHAnsi" w:hAnsiTheme="majorHAnsi" w:cstheme="majorHAnsi"/>
-          <w:color w:val="000000"/>
-          <w:sz w:val="28"/>
-          <w:szCs w:val="28"/>
-        </w:rPr>
       </w:r>
     </w:p>
     <w:p>
@@ -1296,21 +1097,11 @@
       <w:r>
         <w:rPr>
           <w:rFonts w:asciiTheme="majorHAnsi" w:hAnsiTheme="majorHAnsi" w:cstheme="majorHAnsi"/>
-          <w:b/>
-          <w:bCs/>
           <w:color w:val="000000"/>
           <w:sz w:val="28"/>
           <w:szCs w:val="28"/>
         </w:rPr>
         <w:t>Upload ảnh trực tiếp: Thủ thư có thể tải ảnh sản phẩm từ máy tính hoặc dán URL ảnh, lưu trữ dưới dạng base64.</w:t>
-      </w:r>
-      <w:r>
-        <w:rPr>
-          <w:rFonts w:asciiTheme="majorHAnsi" w:hAnsiTheme="majorHAnsi" w:cstheme="majorHAnsi"/>
-          <w:color w:val="000000"/>
-          <w:sz w:val="28"/>
-          <w:szCs w:val="28"/>
-        </w:rPr>
       </w:r>
     </w:p>
     <w:p>
@@ -1331,31 +1122,11 @@
       <w:r>
         <w:rPr>
           <w:rFonts w:asciiTheme="majorHAnsi" w:hAnsiTheme="majorHAnsi" w:cstheme="majorHAnsi"/>
-          <w:b/>
-          <w:bCs/>
           <w:color w:val="000000"/>
           <w:sz w:val="28"/>
           <w:szCs w:val="28"/>
         </w:rPr>
         <w:t>Xuất CSV: Hỗ trợ xuất danh sách tài nguyên, phiếu mượn ra file CSV UTF-8 chuẩn tiếng Việt.</w:t>
-      </w:r>
-      <w:r>
-        <w:rPr>
-          <w:rFonts w:asciiTheme="majorHAnsi" w:hAnsiTheme="majorHAnsi" w:cstheme="majorHAnsi"/>
-          <w:b/>
-          <w:bCs/>
-          <w:color w:val="000000"/>
-          <w:sz w:val="28"/>
-          <w:szCs w:val="28"/>
-        </w:rPr>
-      </w:r>
-      <w:r>
-        <w:rPr>
-          <w:rFonts w:asciiTheme="majorHAnsi" w:hAnsiTheme="majorHAnsi" w:cstheme="majorHAnsi"/>
-          <w:color w:val="000000"/>
-          <w:sz w:val="28"/>
-          <w:szCs w:val="28"/>
-        </w:rPr>
       </w:r>
     </w:p>
     <w:p>
@@ -1376,21 +1147,11 @@
       <w:r>
         <w:rPr>
           <w:rFonts w:asciiTheme="majorHAnsi" w:hAnsiTheme="majorHAnsi" w:cstheme="majorHAnsi"/>
-          <w:b/>
-          <w:bCs/>
           <w:color w:val="000000"/>
           <w:sz w:val="28"/>
           <w:szCs w:val="28"/>
         </w:rPr>
         <w:t>Responsive Design: Giao diện tự thích ứng với mọi kích thước màn hình — desktop, tablet, điện thoại.</w:t>
-      </w:r>
-      <w:r>
-        <w:rPr>
-          <w:rFonts w:asciiTheme="majorHAnsi" w:hAnsiTheme="majorHAnsi" w:cstheme="majorHAnsi"/>
-          <w:color w:val="000000"/>
-          <w:sz w:val="28"/>
-          <w:szCs w:val="28"/>
-        </w:rPr>
       </w:r>
     </w:p>
     <w:p>
@@ -1445,6 +1206,7 @@
           <w:sz w:val="28"/>
           <w:szCs w:val="28"/>
         </w:rPr>
+        <w:lastRenderedPageBreak/>
         <w:t>Phương pháp phân tích yêu cầu: Khảo sát quy trình mượn trả tại thư viện trường THPT Hoàng Diệu.</w:t>
       </w:r>
     </w:p>
@@ -1471,13 +1233,6 @@
         </w:rPr>
         <w:t>Phương pháp thiết kế giao diện: Áp dụng nguyên tắc UI/UX hiện đại, tone màu teal tươi sáng, hỗ trợ dark mode.</w:t>
       </w:r>
-      <w:r>
-        <w:rPr>
-          <w:rFonts w:asciiTheme="majorHAnsi" w:hAnsiTheme="majorHAnsi" w:cstheme="majorHAnsi"/>
-          <w:sz w:val="28"/>
-          <w:szCs w:val="28"/>
-        </w:rPr>
-      </w:r>
     </w:p>
     <w:p>
       <w:pPr>
@@ -1526,24 +1281,6 @@
         </w:rPr>
         <w:t>Phương pháp triển khai: Deploy tự động qua Vercel CI/CD, mã nguồn quản lý trên GitHub.</w:t>
       </w:r>
-      <w:r>
-        <w:rPr>
-          <w:rFonts w:asciiTheme="majorHAnsi" w:hAnsiTheme="majorHAnsi" w:cstheme="majorHAnsi"/>
-          <w:sz w:val="28"/>
-          <w:szCs w:val="28"/>
-        </w:rPr>
-      </w:r>
-    </w:p>
-    <w:p>
-      <w:pPr>
-        <w:spacing w:line="276" w:lineRule="auto"/>
-        <w:contextualSpacing/>
-        <w:rPr>
-          <w:rFonts w:asciiTheme="majorHAnsi" w:hAnsiTheme="majorHAnsi" w:cstheme="majorHAnsi"/>
-          <w:sz w:val="28"/>
-          <w:szCs w:val="28"/>
-        </w:rPr>
-      </w:pPr>
     </w:p>
     <w:p>
       <w:pPr>
@@ -1687,29 +1424,6 @@
     </w:p>
     <w:p>
       <w:pPr>
-        <w:spacing w:line="276" w:lineRule="auto"/>
-        <w:contextualSpacing/>
-        <w:rPr>
-          <w:rFonts w:asciiTheme="majorHAnsi" w:hAnsiTheme="majorHAnsi" w:cstheme="majorHAnsi"/>
-          <w:sz w:val="28"/>
-          <w:szCs w:val="28"/>
-        </w:rPr>
-      </w:pPr>
-    </w:p>
-    <w:p>
-      <w:pPr>
-        <w:pageBreakBefore/>
-        <w:spacing w:line="276" w:lineRule="auto"/>
-        <w:contextualSpacing/>
-        <w:rPr>
-          <w:rFonts w:asciiTheme="majorHAnsi" w:hAnsiTheme="majorHAnsi" w:cstheme="majorHAnsi"/>
-          <w:sz w:val="28"/>
-          <w:szCs w:val="28"/>
-        </w:rPr>
-      </w:pPr>
-    </w:p>
-    <w:p>
-      <w:pPr>
         <w:pStyle w:val="Heading1"/>
         <w:spacing w:before="0" w:after="0" w:line="276" w:lineRule="auto"/>
         <w:contextualSpacing/>
@@ -1726,20 +1440,6 @@
     </w:p>
     <w:p>
       <w:pPr>
-        <w:pBdr>
-          <w:bottom w:val="single" w:sz="6" w:space="1" w:color="2E74B5"/>
-        </w:pBdr>
-        <w:spacing w:line="276" w:lineRule="auto"/>
-        <w:contextualSpacing/>
-        <w:rPr>
-          <w:rFonts w:asciiTheme="majorHAnsi" w:hAnsiTheme="majorHAnsi" w:cstheme="majorHAnsi"/>
-          <w:sz w:val="28"/>
-          <w:szCs w:val="28"/>
-        </w:rPr>
-      </w:pPr>
-    </w:p>
-    <w:p>
-      <w:pPr>
         <w:pStyle w:val="Heading2"/>
         <w:spacing w:before="0" w:after="0" w:line="276" w:lineRule="auto"/>
         <w:contextualSpacing/>
@@ -1778,6 +1478,18 @@
         </w:rPr>
         <w:t>Quản lý thư viện là một trong những hoạt động thiết yếu của nhà trường. Việc số hóa quy trình mượn trả giúp tăng hiệu quả phục vụ bạn đọc, giảm sai sót và tiết kiệm thời gian cho cả thủ thư lẫn người mượn.</w:t>
       </w:r>
+    </w:p>
+    <w:p>
+      <w:pPr>
+        <w:spacing w:line="276" w:lineRule="auto"/>
+        <w:contextualSpacing/>
+        <w:jc w:val="both"/>
+        <w:rPr>
+          <w:rFonts w:asciiTheme="majorHAnsi" w:hAnsiTheme="majorHAnsi" w:cstheme="majorHAnsi"/>
+          <w:sz w:val="28"/>
+          <w:szCs w:val="28"/>
+        </w:rPr>
+      </w:pPr>
       <w:r>
         <w:rPr>
           <w:rFonts w:asciiTheme="majorHAnsi" w:hAnsiTheme="majorHAnsi" w:cstheme="majorHAnsi"/>
@@ -1785,43 +1497,7 @@
           <w:sz w:val="28"/>
           <w:szCs w:val="28"/>
         </w:rPr>
-      </w:r>
-    </w:p>
-    <w:p>
-      <w:pPr>
-        <w:spacing w:line="276" w:lineRule="auto"/>
-        <w:contextualSpacing/>
-        <w:jc w:val="both"/>
-        <w:rPr>
-          <w:rFonts w:asciiTheme="majorHAnsi" w:hAnsiTheme="majorHAnsi" w:cstheme="majorHAnsi"/>
-          <w:sz w:val="28"/>
-          <w:szCs w:val="28"/>
-        </w:rPr>
-      </w:pPr>
-      <w:r>
-        <w:rPr>
-          <w:rFonts w:asciiTheme="majorHAnsi" w:hAnsiTheme="majorHAnsi" w:cstheme="majorHAnsi"/>
-          <w:color w:val="000000"/>
-          <w:sz w:val="28"/>
-          <w:szCs w:val="28"/>
-        </w:rPr>
         <w:t>Nghiên cứu về chuyển đổi số trong giáo dục cho thấy các trường áp dụng hệ thống quản lý thư viện trực tuyến giảm được 60-80% thời gian xử lý phiếu mượn và tăng 40% lượt sử dụng thư viện.</w:t>
-      </w:r>
-      <w:r>
-        <w:rPr>
-          <w:rFonts w:asciiTheme="majorHAnsi" w:hAnsiTheme="majorHAnsi" w:cstheme="majorHAnsi"/>
-          <w:color w:val="000000"/>
-          <w:sz w:val="28"/>
-          <w:szCs w:val="28"/>
-        </w:rPr>
-      </w:r>
-      <w:r>
-        <w:rPr>
-          <w:rFonts w:asciiTheme="majorHAnsi" w:hAnsiTheme="majorHAnsi" w:cstheme="majorHAnsi"/>
-          <w:color w:val="000000"/>
-          <w:sz w:val="28"/>
-          <w:szCs w:val="28"/>
-        </w:rPr>
       </w:r>
     </w:p>
     <w:p>
@@ -1896,14 +1572,6 @@
           <w:szCs w:val="28"/>
         </w:rPr>
         <w:t>Ứng dụng được xây dựng bằng React 19 + Vite 8 (SPA), sử dụng Firebase Authentication để xác thực người dùng và Firestore để lưu trữ dữ liệu. Triển khai trên Vercel với CI/CD tự động từ GitHub.</w:t>
-      </w:r>
-      <w:r>
-        <w:rPr>
-          <w:rFonts w:asciiTheme="majorHAnsi" w:hAnsiTheme="majorHAnsi" w:cstheme="majorHAnsi"/>
-          <w:color w:val="000000"/>
-          <w:sz w:val="28"/>
-          <w:szCs w:val="28"/>
-        </w:rPr>
       </w:r>
     </w:p>
     <w:p>
@@ -1967,21 +1635,11 @@
       <w:r>
         <w:rPr>
           <w:rFonts w:asciiTheme="majorHAnsi" w:hAnsiTheme="majorHAnsi" w:cstheme="majorHAnsi"/>
-          <w:b/>
-          <w:bCs/>
           <w:color w:val="000000"/>
           <w:sz w:val="28"/>
           <w:szCs w:val="28"/>
         </w:rPr>
         <w:t>Tab Danh mục tài nguyên: Bảng tra cứu sách/thiết bị với tìm kiếm, lọc theo nhóm/loại, phân trang.</w:t>
-      </w:r>
-      <w:r>
-        <w:rPr>
-          <w:rFonts w:asciiTheme="majorHAnsi" w:hAnsiTheme="majorHAnsi" w:cstheme="majorHAnsi"/>
-          <w:color w:val="000000"/>
-          <w:sz w:val="28"/>
-          <w:szCs w:val="28"/>
-        </w:rPr>
       </w:r>
     </w:p>
     <w:p>
@@ -2002,31 +1660,11 @@
       <w:r>
         <w:rPr>
           <w:rFonts w:asciiTheme="majorHAnsi" w:hAnsiTheme="majorHAnsi" w:cstheme="majorHAnsi"/>
-          <w:b/>
-          <w:bCs/>
           <w:color w:val="000000"/>
           <w:sz w:val="28"/>
           <w:szCs w:val="28"/>
         </w:rPr>
         <w:t>Tab Phiếu mượn: Danh sách phiếu mượn với filter theo trạng thái (Chờ duyệt/Đã duyệt/Đã trả/Quá hạn), nút Duyệt/Từ chối/Nhận trả/Xóa.</w:t>
-      </w:r>
-      <w:r>
-        <w:rPr>
-          <w:rFonts w:asciiTheme="majorHAnsi" w:hAnsiTheme="majorHAnsi" w:cstheme="majorHAnsi"/>
-          <w:b/>
-          <w:bCs/>
-          <w:color w:val="000000"/>
-          <w:sz w:val="28"/>
-          <w:szCs w:val="28"/>
-        </w:rPr>
-      </w:r>
-      <w:r>
-        <w:rPr>
-          <w:rFonts w:asciiTheme="majorHAnsi" w:hAnsiTheme="majorHAnsi" w:cstheme="majorHAnsi"/>
-          <w:color w:val="000000"/>
-          <w:sz w:val="28"/>
-          <w:szCs w:val="28"/>
-        </w:rPr>
       </w:r>
     </w:p>
     <w:p>
@@ -2047,21 +1685,11 @@
       <w:r>
         <w:rPr>
           <w:rFonts w:asciiTheme="majorHAnsi" w:hAnsiTheme="majorHAnsi" w:cstheme="majorHAnsi"/>
-          <w:b/>
-          <w:bCs/>
           <w:color w:val="000000"/>
           <w:sz w:val="28"/>
           <w:szCs w:val="28"/>
         </w:rPr>
         <w:t>Tab Thống kê: Dashboard tổng quan KPI, biểu đồ phân bố, cảnh báo quá hạn, nút Reset thống kê.</w:t>
-      </w:r>
-      <w:r>
-        <w:rPr>
-          <w:rFonts w:asciiTheme="majorHAnsi" w:hAnsiTheme="majorHAnsi" w:cstheme="majorHAnsi"/>
-          <w:color w:val="000000"/>
-          <w:sz w:val="28"/>
-          <w:szCs w:val="28"/>
-        </w:rPr>
       </w:r>
     </w:p>
     <w:p>
@@ -2082,21 +1710,11 @@
       <w:r>
         <w:rPr>
           <w:rFonts w:asciiTheme="majorHAnsi" w:hAnsiTheme="majorHAnsi" w:cstheme="majorHAnsi"/>
-          <w:b/>
-          <w:bCs/>
           <w:color w:val="000000"/>
           <w:sz w:val="28"/>
           <w:szCs w:val="28"/>
         </w:rPr>
         <w:t>Tab Quản trị: Thêm/Sửa/Xóa tài nguyên, upload ảnh sản phẩm, xuất CSV.</w:t>
-      </w:r>
-      <w:r>
-        <w:rPr>
-          <w:rFonts w:asciiTheme="majorHAnsi" w:hAnsiTheme="majorHAnsi" w:cstheme="majorHAnsi"/>
-          <w:color w:val="000000"/>
-          <w:sz w:val="28"/>
-          <w:szCs w:val="28"/>
-        </w:rPr>
       </w:r>
     </w:p>
     <w:p>
@@ -2117,21 +1735,11 @@
       <w:r>
         <w:rPr>
           <w:rFonts w:asciiTheme="majorHAnsi" w:hAnsiTheme="majorHAnsi" w:cstheme="majorHAnsi"/>
-          <w:b/>
-          <w:bCs/>
           <w:color w:val="000000"/>
           <w:sz w:val="28"/>
           <w:szCs w:val="28"/>
         </w:rPr>
         <w:t>Tab Giới thiệu: Thông tin trường, tác giả, hệ thống.</w:t>
-      </w:r>
-      <w:r>
-        <w:rPr>
-          <w:rFonts w:asciiTheme="majorHAnsi" w:hAnsiTheme="majorHAnsi" w:cstheme="majorHAnsi"/>
-          <w:color w:val="000000"/>
-          <w:sz w:val="28"/>
-          <w:szCs w:val="28"/>
-        </w:rPr>
       </w:r>
     </w:p>
     <w:p>
@@ -2153,6 +1761,7 @@
           <w:sz w:val="28"/>
           <w:szCs w:val="28"/>
         </w:rPr>
+        <w:lastRenderedPageBreak/>
         <w:t>c. Quy trình Mượn tài nguyên</w:t>
       </w:r>
     </w:p>
@@ -2175,14 +1784,6 @@
           <w:szCs w:val="28"/>
         </w:rPr>
         <w:t>Bạn đọc đăng nhập → Chọn tài nguyên → Bấm "Mượn" → Điền thông tin → Gửi yêu cầu.</w:t>
-      </w:r>
-      <w:r>
-        <w:rPr>
-          <w:rFonts w:asciiTheme="majorHAnsi" w:hAnsiTheme="majorHAnsi" w:cstheme="majorHAnsi"/>
-          <w:color w:val="000000"/>
-          <w:sz w:val="28"/>
-          <w:szCs w:val="28"/>
-        </w:rPr>
       </w:r>
     </w:p>
     <w:p>
@@ -2334,14 +1935,6 @@
           <w:szCs w:val="28"/>
         </w:rPr>
       </w:pPr>
-      <w:r>
-        <w:rPr>
-          <w:rFonts w:asciiTheme="majorHAnsi" w:hAnsiTheme="majorHAnsi" w:cstheme="majorHAnsi"/>
-          <w:color w:val="000000"/>
-          <w:sz w:val="28"/>
-          <w:szCs w:val="28"/>
-        </w:rPr>
-      </w:r>
     </w:p>
     <w:p>
       <w:pPr>
@@ -2387,14 +1980,6 @@
         </w:rPr>
         <w:t>Khi trả: Thủ thư xác nhận nhận trả, ghi nhận tình trạng thiết bị, hoàn số lượng kho.</w:t>
       </w:r>
-      <w:r>
-        <w:rPr>
-          <w:rFonts w:asciiTheme="majorHAnsi" w:hAnsiTheme="majorHAnsi" w:cstheme="majorHAnsi"/>
-          <w:color w:val="000000"/>
-          <w:sz w:val="28"/>
-          <w:szCs w:val="28"/>
-        </w:rPr>
-      </w:r>
     </w:p>
     <w:p>
       <w:pPr>
@@ -2507,13 +2092,6 @@
         </w:rPr>
         <w:t>Sửa thông tin: Cập nhật bất kỳ trường nào, bao gồm upload ảnh sản phẩm.</w:t>
       </w:r>
-      <w:r>
-        <w:rPr>
-          <w:rFonts w:asciiTheme="majorHAnsi" w:hAnsiTheme="majorHAnsi" w:cstheme="majorHAnsi"/>
-          <w:sz w:val="28"/>
-          <w:szCs w:val="28"/>
-        </w:rPr>
-      </w:r>
     </w:p>
     <w:p>
       <w:pPr>
@@ -2598,14 +2176,6 @@
           <w:szCs w:val="28"/>
         </w:rPr>
       </w:pPr>
-      <w:r>
-        <w:rPr>
-          <w:rFonts w:asciiTheme="majorHAnsi" w:hAnsiTheme="majorHAnsi" w:cstheme="majorHAnsi"/>
-          <w:color w:val="000000"/>
-          <w:sz w:val="28"/>
-          <w:szCs w:val="28"/>
-        </w:rPr>
-      </w:r>
     </w:p>
     <w:p>
       <w:pPr>
@@ -2627,16 +2197,6 @@
           <w:szCs w:val="28"/>
         </w:rPr>
         <w:t>e. Dashboard Thống kê</w:t>
-      </w:r>
-      <w:r>
-        <w:rPr>
-          <w:rFonts w:asciiTheme="majorHAnsi" w:hAnsiTheme="majorHAnsi" w:cstheme="majorHAnsi"/>
-          <w:b/>
-          <w:bCs/>
-          <w:color w:val="2E74B5"/>
-          <w:sz w:val="28"/>
-          <w:szCs w:val="28"/>
-        </w:rPr>
       </w:r>
     </w:p>
     <w:p>
@@ -2730,13 +2290,6 @@
           <w:szCs w:val="28"/>
         </w:rPr>
         <w:t>Phân bố người mượn theo đối tượng (Giáo viên/Học sinh).</w:t>
-      </w:r>
-      <w:r>
-        <w:rPr>
-          <w:rFonts w:asciiTheme="majorHAnsi" w:hAnsiTheme="majorHAnsi" w:cstheme="majorHAnsi"/>
-          <w:sz w:val="28"/>
-          <w:szCs w:val="28"/>
-        </w:rPr>
       </w:r>
     </w:p>
     <w:p>
@@ -2816,22 +2369,10 @@
         <w:gridCol w:w="6560"/>
       </w:tblGrid>
       <w:tr>
-        <w:tblPrEx>
-          <w:tblCellMar>
-            <w:top w:w="0" w:type="dxa"/>
-            <w:bottom w:w="0" w:type="dxa"/>
-          </w:tblCellMar>
-        </w:tblPrEx>
         <w:tc>
           <w:tcPr>
             <w:tcW w:w="2800" w:type="dxa"/>
-            <w:tcBorders>
-              <w:top w:val="single" w:sz="1" w:space="0" w:color="CCCCCC"/>
-              <w:left w:val="single" w:sz="1" w:space="0" w:color="CCCCCC"/>
-              <w:bottom w:val="single" w:sz="1" w:space="0" w:color="CCCCCC"/>
-              <w:right w:val="single" w:sz="1" w:space="0" w:color="CCCCCC"/>
-            </w:tcBorders>
-            <w:shd w:val="clear" w:color="auto" w:fill="1F4E79"/>
+            <w:shd w:val="clear" w:color="auto" w:fill="auto"/>
             <w:tcMar>
               <w:top w:w="100" w:type="dxa"/>
               <w:left w:w="150" w:type="dxa"/>
@@ -2855,7 +2396,6 @@
                 <w:rFonts w:asciiTheme="majorHAnsi" w:hAnsiTheme="majorHAnsi" w:cstheme="majorHAnsi"/>
                 <w:b/>
                 <w:bCs/>
-                <w:color w:val="FFFFFF"/>
                 <w:sz w:val="28"/>
                 <w:szCs w:val="28"/>
               </w:rPr>
@@ -2866,13 +2406,7 @@
         <w:tc>
           <w:tcPr>
             <w:tcW w:w="6560" w:type="dxa"/>
-            <w:tcBorders>
-              <w:top w:val="single" w:sz="1" w:space="0" w:color="CCCCCC"/>
-              <w:left w:val="single" w:sz="1" w:space="0" w:color="CCCCCC"/>
-              <w:bottom w:val="single" w:sz="1" w:space="0" w:color="CCCCCC"/>
-              <w:right w:val="single" w:sz="1" w:space="0" w:color="CCCCCC"/>
-            </w:tcBorders>
-            <w:shd w:val="clear" w:color="auto" w:fill="1F4E79"/>
+            <w:shd w:val="clear" w:color="auto" w:fill="auto"/>
             <w:tcMar>
               <w:top w:w="100" w:type="dxa"/>
               <w:left w:w="150" w:type="dxa"/>
@@ -2896,7 +2430,6 @@
                 <w:rFonts w:asciiTheme="majorHAnsi" w:hAnsiTheme="majorHAnsi" w:cstheme="majorHAnsi"/>
                 <w:b/>
                 <w:bCs/>
-                <w:color w:val="FFFFFF"/>
                 <w:sz w:val="28"/>
                 <w:szCs w:val="28"/>
               </w:rPr>
@@ -2906,22 +2439,10 @@
         </w:tc>
       </w:tr>
       <w:tr>
-        <w:tblPrEx>
-          <w:tblCellMar>
-            <w:top w:w="0" w:type="dxa"/>
-            <w:bottom w:w="0" w:type="dxa"/>
-          </w:tblCellMar>
-        </w:tblPrEx>
         <w:tc>
           <w:tcPr>
             <w:tcW w:w="2800" w:type="dxa"/>
-            <w:tcBorders>
-              <w:top w:val="single" w:sz="1" w:space="0" w:color="CCCCCC"/>
-              <w:left w:val="single" w:sz="1" w:space="0" w:color="CCCCCC"/>
-              <w:bottom w:val="single" w:sz="1" w:space="0" w:color="CCCCCC"/>
-              <w:right w:val="single" w:sz="1" w:space="0" w:color="CCCCCC"/>
-            </w:tcBorders>
-            <w:shd w:val="clear" w:color="auto" w:fill="DEEAF1"/>
+            <w:shd w:val="clear" w:color="auto" w:fill="auto"/>
             <w:tcMar>
               <w:top w:w="80" w:type="dxa"/>
               <w:left w:w="150" w:type="dxa"/>
@@ -2947,6 +2468,7 @@
                 <w:sz w:val="28"/>
                 <w:szCs w:val="28"/>
               </w:rPr>
+              <w:lastRenderedPageBreak/>
               <w:t>Ngôn ngữ</w:t>
             </w:r>
           </w:p>
@@ -2954,13 +2476,7 @@
         <w:tc>
           <w:tcPr>
             <w:tcW w:w="6560" w:type="dxa"/>
-            <w:tcBorders>
-              <w:top w:val="single" w:sz="1" w:space="0" w:color="CCCCCC"/>
-              <w:left w:val="single" w:sz="1" w:space="0" w:color="CCCCCC"/>
-              <w:bottom w:val="single" w:sz="1" w:space="0" w:color="CCCCCC"/>
-              <w:right w:val="single" w:sz="1" w:space="0" w:color="CCCCCC"/>
-            </w:tcBorders>
-            <w:shd w:val="clear" w:color="auto" w:fill="DEEAF1"/>
+            <w:shd w:val="clear" w:color="auto" w:fill="auto"/>
             <w:tcMar>
               <w:top w:w="80" w:type="dxa"/>
               <w:left w:w="150" w:type="dxa"/>
@@ -2990,22 +2506,10 @@
         </w:tc>
       </w:tr>
       <w:tr>
-        <w:tblPrEx>
-          <w:tblCellMar>
-            <w:top w:w="0" w:type="dxa"/>
-            <w:bottom w:w="0" w:type="dxa"/>
-          </w:tblCellMar>
-        </w:tblPrEx>
         <w:tc>
           <w:tcPr>
             <w:tcW w:w="2800" w:type="dxa"/>
-            <w:tcBorders>
-              <w:top w:val="single" w:sz="1" w:space="0" w:color="CCCCCC"/>
-              <w:left w:val="single" w:sz="1" w:space="0" w:color="CCCCCC"/>
-              <w:bottom w:val="single" w:sz="1" w:space="0" w:color="CCCCCC"/>
-              <w:right w:val="single" w:sz="1" w:space="0" w:color="CCCCCC"/>
-            </w:tcBorders>
-            <w:shd w:val="clear" w:color="auto" w:fill="FFFFFF"/>
+            <w:shd w:val="clear" w:color="auto" w:fill="auto"/>
             <w:tcMar>
               <w:top w:w="80" w:type="dxa"/>
               <w:left w:w="150" w:type="dxa"/>
@@ -3038,13 +2542,7 @@
         <w:tc>
           <w:tcPr>
             <w:tcW w:w="6560" w:type="dxa"/>
-            <w:tcBorders>
-              <w:top w:val="single" w:sz="1" w:space="0" w:color="CCCCCC"/>
-              <w:left w:val="single" w:sz="1" w:space="0" w:color="CCCCCC"/>
-              <w:bottom w:val="single" w:sz="1" w:space="0" w:color="CCCCCC"/>
-              <w:right w:val="single" w:sz="1" w:space="0" w:color="CCCCCC"/>
-            </w:tcBorders>
-            <w:shd w:val="clear" w:color="auto" w:fill="FFFFFF"/>
+            <w:shd w:val="clear" w:color="auto" w:fill="auto"/>
             <w:tcMar>
               <w:top w:w="80" w:type="dxa"/>
               <w:left w:w="150" w:type="dxa"/>
@@ -3074,22 +2572,10 @@
         </w:tc>
       </w:tr>
       <w:tr>
-        <w:tblPrEx>
-          <w:tblCellMar>
-            <w:top w:w="0" w:type="dxa"/>
-            <w:bottom w:w="0" w:type="dxa"/>
-          </w:tblCellMar>
-        </w:tblPrEx>
         <w:tc>
           <w:tcPr>
             <w:tcW w:w="2800" w:type="dxa"/>
-            <w:tcBorders>
-              <w:top w:val="single" w:sz="1" w:space="0" w:color="CCCCCC"/>
-              <w:left w:val="single" w:sz="1" w:space="0" w:color="CCCCCC"/>
-              <w:bottom w:val="single" w:sz="1" w:space="0" w:color="CCCCCC"/>
-              <w:right w:val="single" w:sz="1" w:space="0" w:color="CCCCCC"/>
-            </w:tcBorders>
-            <w:shd w:val="clear" w:color="auto" w:fill="DEEAF1"/>
+            <w:shd w:val="clear" w:color="auto" w:fill="auto"/>
             <w:tcMar>
               <w:top w:w="80" w:type="dxa"/>
               <w:left w:w="150" w:type="dxa"/>
@@ -3122,13 +2608,7 @@
         <w:tc>
           <w:tcPr>
             <w:tcW w:w="6560" w:type="dxa"/>
-            <w:tcBorders>
-              <w:top w:val="single" w:sz="1" w:space="0" w:color="CCCCCC"/>
-              <w:left w:val="single" w:sz="1" w:space="0" w:color="CCCCCC"/>
-              <w:bottom w:val="single" w:sz="1" w:space="0" w:color="CCCCCC"/>
-              <w:right w:val="single" w:sz="1" w:space="0" w:color="CCCCCC"/>
-            </w:tcBorders>
-            <w:shd w:val="clear" w:color="auto" w:fill="DEEAF1"/>
+            <w:shd w:val="clear" w:color="auto" w:fill="auto"/>
             <w:tcMar>
               <w:top w:w="80" w:type="dxa"/>
               <w:left w:w="150" w:type="dxa"/>
@@ -3158,22 +2638,10 @@
         </w:tc>
       </w:tr>
       <w:tr>
-        <w:tblPrEx>
-          <w:tblCellMar>
-            <w:top w:w="0" w:type="dxa"/>
-            <w:bottom w:w="0" w:type="dxa"/>
-          </w:tblCellMar>
-        </w:tblPrEx>
         <w:tc>
           <w:tcPr>
             <w:tcW w:w="2800" w:type="dxa"/>
-            <w:tcBorders>
-              <w:top w:val="single" w:sz="1" w:space="0" w:color="CCCCCC"/>
-              <w:left w:val="single" w:sz="1" w:space="0" w:color="CCCCCC"/>
-              <w:bottom w:val="single" w:sz="1" w:space="0" w:color="CCCCCC"/>
-              <w:right w:val="single" w:sz="1" w:space="0" w:color="CCCCCC"/>
-            </w:tcBorders>
-            <w:shd w:val="clear" w:color="auto" w:fill="FFFFFF"/>
+            <w:shd w:val="clear" w:color="auto" w:fill="auto"/>
             <w:tcMar>
               <w:top w:w="80" w:type="dxa"/>
               <w:left w:w="150" w:type="dxa"/>
@@ -3206,13 +2674,7 @@
         <w:tc>
           <w:tcPr>
             <w:tcW w:w="6560" w:type="dxa"/>
-            <w:tcBorders>
-              <w:top w:val="single" w:sz="1" w:space="0" w:color="CCCCCC"/>
-              <w:left w:val="single" w:sz="1" w:space="0" w:color="CCCCCC"/>
-              <w:bottom w:val="single" w:sz="1" w:space="0" w:color="CCCCCC"/>
-              <w:right w:val="single" w:sz="1" w:space="0" w:color="CCCCCC"/>
-            </w:tcBorders>
-            <w:shd w:val="clear" w:color="auto" w:fill="FFFFFF"/>
+            <w:shd w:val="clear" w:color="auto" w:fill="auto"/>
             <w:tcMar>
               <w:top w:w="80" w:type="dxa"/>
               <w:left w:w="150" w:type="dxa"/>
@@ -3242,22 +2704,10 @@
         </w:tc>
       </w:tr>
       <w:tr>
-        <w:tblPrEx>
-          <w:tblCellMar>
-            <w:top w:w="0" w:type="dxa"/>
-            <w:bottom w:w="0" w:type="dxa"/>
-          </w:tblCellMar>
-        </w:tblPrEx>
         <w:tc>
           <w:tcPr>
             <w:tcW w:w="2800" w:type="dxa"/>
-            <w:tcBorders>
-              <w:top w:val="single" w:sz="1" w:space="0" w:color="CCCCCC"/>
-              <w:left w:val="single" w:sz="1" w:space="0" w:color="CCCCCC"/>
-              <w:bottom w:val="single" w:sz="1" w:space="0" w:color="CCCCCC"/>
-              <w:right w:val="single" w:sz="1" w:space="0" w:color="CCCCCC"/>
-            </w:tcBorders>
-            <w:shd w:val="clear" w:color="auto" w:fill="DEEAF1"/>
+            <w:shd w:val="clear" w:color="auto" w:fill="auto"/>
             <w:tcMar>
               <w:top w:w="80" w:type="dxa"/>
               <w:left w:w="150" w:type="dxa"/>
@@ -3290,13 +2740,7 @@
         <w:tc>
           <w:tcPr>
             <w:tcW w:w="6560" w:type="dxa"/>
-            <w:tcBorders>
-              <w:top w:val="single" w:sz="1" w:space="0" w:color="CCCCCC"/>
-              <w:left w:val="single" w:sz="1" w:space="0" w:color="CCCCCC"/>
-              <w:bottom w:val="single" w:sz="1" w:space="0" w:color="CCCCCC"/>
-              <w:right w:val="single" w:sz="1" w:space="0" w:color="CCCCCC"/>
-            </w:tcBorders>
-            <w:shd w:val="clear" w:color="auto" w:fill="DEEAF1"/>
+            <w:shd w:val="clear" w:color="auto" w:fill="auto"/>
             <w:tcMar>
               <w:top w:w="80" w:type="dxa"/>
               <w:left w:w="150" w:type="dxa"/>
@@ -3326,22 +2770,10 @@
         </w:tc>
       </w:tr>
       <w:tr>
-        <w:tblPrEx>
-          <w:tblCellMar>
-            <w:top w:w="0" w:type="dxa"/>
-            <w:bottom w:w="0" w:type="dxa"/>
-          </w:tblCellMar>
-        </w:tblPrEx>
         <w:tc>
           <w:tcPr>
             <w:tcW w:w="2800" w:type="dxa"/>
-            <w:tcBorders>
-              <w:top w:val="single" w:sz="1" w:space="0" w:color="CCCCCC"/>
-              <w:left w:val="single" w:sz="1" w:space="0" w:color="CCCCCC"/>
-              <w:bottom w:val="single" w:sz="1" w:space="0" w:color="CCCCCC"/>
-              <w:right w:val="single" w:sz="1" w:space="0" w:color="CCCCCC"/>
-            </w:tcBorders>
-            <w:shd w:val="clear" w:color="auto" w:fill="FFFFFF"/>
+            <w:shd w:val="clear" w:color="auto" w:fill="auto"/>
             <w:tcMar>
               <w:top w:w="80" w:type="dxa"/>
               <w:left w:w="150" w:type="dxa"/>
@@ -3367,7 +2799,6 @@
                 <w:sz w:val="28"/>
                 <w:szCs w:val="28"/>
               </w:rPr>
-              <w:lastRenderedPageBreak/>
               <w:t>Kích thước</w:t>
             </w:r>
           </w:p>
@@ -3375,13 +2806,7 @@
         <w:tc>
           <w:tcPr>
             <w:tcW w:w="6560" w:type="dxa"/>
-            <w:tcBorders>
-              <w:top w:val="single" w:sz="1" w:space="0" w:color="CCCCCC"/>
-              <w:left w:val="single" w:sz="1" w:space="0" w:color="CCCCCC"/>
-              <w:bottom w:val="single" w:sz="1" w:space="0" w:color="CCCCCC"/>
-              <w:right w:val="single" w:sz="1" w:space="0" w:color="CCCCCC"/>
-            </w:tcBorders>
-            <w:shd w:val="clear" w:color="auto" w:fill="FFFFFF"/>
+            <w:shd w:val="clear" w:color="auto" w:fill="auto"/>
             <w:tcMar>
               <w:top w:w="80" w:type="dxa"/>
               <w:left w:w="150" w:type="dxa"/>
@@ -3424,18 +2849,6 @@
     </w:p>
     <w:p>
       <w:pPr>
-        <w:pageBreakBefore/>
-        <w:spacing w:line="276" w:lineRule="auto"/>
-        <w:contextualSpacing/>
-        <w:rPr>
-          <w:rFonts w:asciiTheme="majorHAnsi" w:hAnsiTheme="majorHAnsi" w:cstheme="majorHAnsi"/>
-          <w:sz w:val="28"/>
-          <w:szCs w:val="28"/>
-        </w:rPr>
-      </w:pPr>
-    </w:p>
-    <w:p>
-      <w:pPr>
         <w:pStyle w:val="Heading1"/>
         <w:spacing w:before="0" w:after="0" w:line="276" w:lineRule="auto"/>
         <w:contextualSpacing/>
@@ -3452,20 +2865,6 @@
     </w:p>
     <w:p>
       <w:pPr>
-        <w:pBdr>
-          <w:bottom w:val="single" w:sz="6" w:space="1" w:color="2E74B5"/>
-        </w:pBdr>
-        <w:spacing w:line="276" w:lineRule="auto"/>
-        <w:contextualSpacing/>
-        <w:rPr>
-          <w:rFonts w:asciiTheme="majorHAnsi" w:hAnsiTheme="majorHAnsi" w:cstheme="majorHAnsi"/>
-          <w:sz w:val="28"/>
-          <w:szCs w:val="28"/>
-        </w:rPr>
-      </w:pPr>
-    </w:p>
-    <w:p>
-      <w:pPr>
         <w:pStyle w:val="Heading2"/>
         <w:spacing w:before="0" w:after="0" w:line="276" w:lineRule="auto"/>
         <w:contextualSpacing/>
@@ -3504,17 +2903,6 @@
         </w:rPr>
         <w:t>Ứng dụng Thư Viện Số THPT Hoàng Diệu đã hoàn thiện đầy đủ các tính năng và hoạt động ổn định trên mọi trình duyệt hiện đại:</w:t>
       </w:r>
-    </w:p>
-    <w:p>
-      <w:pPr>
-        <w:spacing w:line="276" w:lineRule="auto"/>
-        <w:contextualSpacing/>
-        <w:rPr>
-          <w:rFonts w:asciiTheme="majorHAnsi" w:hAnsiTheme="majorHAnsi" w:cstheme="majorHAnsi"/>
-          <w:sz w:val="28"/>
-          <w:szCs w:val="28"/>
-        </w:rPr>
-      </w:pPr>
     </w:p>
     <w:p>
       <w:pPr>
@@ -3558,14 +2946,6 @@
         </w:rPr>
         <w:t>Tone màu teal tươi sáng, hỗ trợ dark mode, responsive mọi thiết bị. Header với gradient teal, navigation bar có badge thông báo phiếu chờ duyệt. Bảng dữ liệu compact, dễ đọc.</w:t>
       </w:r>
-      <w:r>
-        <w:rPr>
-          <w:rFonts w:asciiTheme="majorHAnsi" w:hAnsiTheme="majorHAnsi" w:cstheme="majorHAnsi"/>
-          <w:color w:val="000000"/>
-          <w:sz w:val="28"/>
-          <w:szCs w:val="28"/>
-        </w:rPr>
-      </w:r>
     </w:p>
     <w:p>
       <w:pPr>
@@ -3580,15 +2960,12 @@
       </w:pPr>
       <w:r>
         <w:rPr>
-          <w:rFonts w:asciiTheme="majorHAnsi" w:hAnsiTheme="majorHAnsi" w:cstheme="majorHAnsi"/>
           <w:noProof/>
-          <w:sz w:val="28"/>
-          <w:szCs w:val="28"/>
         </w:rPr>
         <w:drawing>
-          <wp:inline distT="0" distB="0" distL="0" distR="0" wp14:anchorId="624FCBAD" wp14:editId="38EE7DE6">
-            <wp:extent cx="5760085" cy="3470275"/>
-            <wp:effectExtent l="0" t="0" r="0" b="0"/>
+          <wp:inline distT="0" distB="0" distL="0" distR="0" wp14:anchorId="57ADB1FB" wp14:editId="731BF633">
+            <wp:extent cx="4330296" cy="3402751"/>
+            <wp:effectExtent l="0" t="0" r="0" b="7620"/>
             <wp:docPr id="1" name="Picture 1"/>
             <wp:cNvGraphicFramePr>
               <a:graphicFrameLocks xmlns:a="http://schemas.openxmlformats.org/drawingml/2006/main" noChangeAspect="1"/>
@@ -3609,7 +2986,7 @@
                   <pic:spPr>
                     <a:xfrm>
                       <a:off x="0" y="0"/>
-                      <a:ext cx="5760085" cy="3470275"/>
+                      <a:ext cx="4336137" cy="3407341"/>
                     </a:xfrm>
                     <a:prstGeom prst="rect">
                       <a:avLst/>
@@ -3683,6 +3060,7 @@
           <w:sz w:val="28"/>
           <w:szCs w:val="28"/>
         </w:rPr>
+        <w:lastRenderedPageBreak/>
         <w:t>Tab Danh mục hiển thị bảng sách/thiết bị với tìm kiếm full-text, lọc theo nhóm (Sách/Thiết bị/Tài liệu), phân trang. Mỗi hàng hiển thị mã, tên, nhóm, vị trí kho, số lượng còn, nút Mượn.</w:t>
       </w:r>
     </w:p>
@@ -3699,17 +3077,13 @@
       </w:pPr>
       <w:r>
         <w:rPr>
-          <w:rFonts w:asciiTheme="majorHAnsi" w:hAnsiTheme="majorHAnsi" w:cstheme="majorHAnsi"/>
           <w:noProof/>
-          <w:sz w:val="28"/>
-          <w:szCs w:val="28"/>
-        </w:rPr>
-        <w:lastRenderedPageBreak/>
+        </w:rPr>
         <w:drawing>
-          <wp:inline distT="0" distB="0" distL="0" distR="0" wp14:anchorId="7B4E613C" wp14:editId="4C239C6A">
-            <wp:extent cx="5011791" cy="2152015"/>
-            <wp:effectExtent l="0" t="0" r="0" b="635"/>
-            <wp:docPr id="7" name="Picture 7"/>
+          <wp:inline distT="0" distB="0" distL="0" distR="0" wp14:anchorId="74C9A93B" wp14:editId="339DB066">
+            <wp:extent cx="5760085" cy="4820285"/>
+            <wp:effectExtent l="0" t="0" r="0" b="0"/>
+            <wp:docPr id="2" name="Picture 2"/>
             <wp:cNvGraphicFramePr>
               <a:graphicFrameLocks xmlns:a="http://schemas.openxmlformats.org/drawingml/2006/main" noChangeAspect="1"/>
             </wp:cNvGraphicFramePr>
@@ -3729,7 +3103,7 @@
                   <pic:spPr>
                     <a:xfrm>
                       <a:off x="0" y="0"/>
-                      <a:ext cx="5032249" cy="2160799"/>
+                      <a:ext cx="5760085" cy="4820285"/>
                     </a:xfrm>
                     <a:prstGeom prst="rect">
                       <a:avLst/>
@@ -3762,14 +3136,6 @@
         </w:rPr>
         <w:t>Hình 2: Danh mục tài nguyên với tìm kiếm và lọc</w:t>
       </w:r>
-      <w:r>
-        <w:rPr>
-          <w:rFonts w:asciiTheme="majorHAnsi" w:hAnsiTheme="majorHAnsi" w:cstheme="majorHAnsi"/>
-          <w:color w:val="595959"/>
-          <w:sz w:val="28"/>
-          <w:szCs w:val="28"/>
-        </w:rPr>
-      </w:r>
     </w:p>
     <w:p>
       <w:pPr>
@@ -3813,14 +3179,6 @@
         </w:rPr>
         <w:t>Tab Phiếu mượn hiển thị tất cả phiếu với trạng thái badge màu sắc (Chờ duyệt/Đã duyệt/Đã trả/Quá hạn/Từ chối). Thủ thư có nút Duyệt, Từ chối, Nhận trả, Xóa trực tiếp.</w:t>
       </w:r>
-      <w:r>
-        <w:rPr>
-          <w:rFonts w:asciiTheme="majorHAnsi" w:hAnsiTheme="majorHAnsi" w:cstheme="majorHAnsi"/>
-          <w:color w:val="000000"/>
-          <w:sz w:val="28"/>
-          <w:szCs w:val="28"/>
-        </w:rPr>
-      </w:r>
     </w:p>
     <w:p>
       <w:pPr>
@@ -3829,22 +3187,21 @@
         <w:jc w:val="center"/>
         <w:rPr>
           <w:rFonts w:asciiTheme="majorHAnsi" w:hAnsiTheme="majorHAnsi" w:cstheme="majorHAnsi"/>
-          <w:sz w:val="28"/>
-          <w:szCs w:val="28"/>
-        </w:rPr>
-      </w:pPr>
-      <w:r>
-        <w:rPr>
-          <w:rFonts w:asciiTheme="majorHAnsi" w:hAnsiTheme="majorHAnsi" w:cstheme="majorHAnsi"/>
+          <w:b/>
+          <w:bCs/>
+          <w:sz w:val="28"/>
+          <w:szCs w:val="28"/>
+        </w:rPr>
+      </w:pPr>
+      <w:r>
+        <w:rPr>
           <w:noProof/>
-          <w:sz w:val="28"/>
-          <w:szCs w:val="28"/>
         </w:rPr>
         <w:drawing>
-          <wp:inline distT="0" distB="0" distL="0" distR="0" wp14:anchorId="5C855810" wp14:editId="11007D84">
-            <wp:extent cx="5760085" cy="2259965"/>
+          <wp:inline distT="0" distB="0" distL="0" distR="0" wp14:anchorId="3393CC5E" wp14:editId="3D138CA1">
+            <wp:extent cx="5760085" cy="1764665"/>
             <wp:effectExtent l="0" t="0" r="0" b="6985"/>
-            <wp:docPr id="8" name="Picture 8"/>
+            <wp:docPr id="3" name="Picture 3"/>
             <wp:cNvGraphicFramePr>
               <a:graphicFrameLocks xmlns:a="http://schemas.openxmlformats.org/drawingml/2006/main" noChangeAspect="1"/>
             </wp:cNvGraphicFramePr>
@@ -3864,7 +3221,7 @@
                   <pic:spPr>
                     <a:xfrm>
                       <a:off x="0" y="0"/>
-                      <a:ext cx="5760085" cy="2259965"/>
+                      <a:ext cx="5760085" cy="1764665"/>
                     </a:xfrm>
                     <a:prstGeom prst="rect">
                       <a:avLst/>
@@ -3938,16 +3295,9 @@
           <w:sz w:val="28"/>
           <w:szCs w:val="28"/>
         </w:rPr>
+        <w:lastRenderedPageBreak/>
         <w:t>Dashboard hiển thị 5 KPI chính, top tài nguyên phổ biến, phân bố đối tượng mượn, cảnh báo quá hạn. Thủ thư có nút Reset thống kê về 0.</w:t>
       </w:r>
-      <w:r>
-        <w:rPr>
-          <w:rFonts w:asciiTheme="majorHAnsi" w:hAnsiTheme="majorHAnsi" w:cstheme="majorHAnsi"/>
-          <w:color w:val="000000"/>
-          <w:sz w:val="28"/>
-          <w:szCs w:val="28"/>
-        </w:rPr>
-      </w:r>
     </w:p>
     <w:p>
       <w:pPr>
@@ -3962,16 +3312,13 @@
       </w:pPr>
       <w:r>
         <w:rPr>
-          <w:rFonts w:asciiTheme="majorHAnsi" w:hAnsiTheme="majorHAnsi" w:cstheme="majorHAnsi"/>
           <w:noProof/>
-          <w:sz w:val="28"/>
-          <w:szCs w:val="28"/>
         </w:rPr>
         <w:drawing>
-          <wp:inline distT="0" distB="0" distL="0" distR="0" wp14:anchorId="020B3267" wp14:editId="058AB1A8">
-            <wp:extent cx="5760085" cy="1847215"/>
-            <wp:effectExtent l="0" t="0" r="0" b="635"/>
-            <wp:docPr id="9" name="Picture 9"/>
+          <wp:inline distT="0" distB="0" distL="0" distR="0" wp14:anchorId="2FC01F66" wp14:editId="58417050">
+            <wp:extent cx="5760085" cy="2985770"/>
+            <wp:effectExtent l="0" t="0" r="0" b="5080"/>
+            <wp:docPr id="4" name="Picture 4"/>
             <wp:cNvGraphicFramePr>
               <a:graphicFrameLocks xmlns:a="http://schemas.openxmlformats.org/drawingml/2006/main" noChangeAspect="1"/>
             </wp:cNvGraphicFramePr>
@@ -3991,7 +3338,7 @@
                   <pic:spPr>
                     <a:xfrm>
                       <a:off x="0" y="0"/>
-                      <a:ext cx="5760085" cy="1847215"/>
+                      <a:ext cx="5760085" cy="2985770"/>
                     </a:xfrm>
                     <a:prstGeom prst="rect">
                       <a:avLst/>
@@ -4046,16 +3393,6 @@
         </w:rPr>
         <w:t>e. Quản trị kho — Thêm/Sửa/Xóa</w:t>
       </w:r>
-      <w:r>
-        <w:rPr>
-          <w:rFonts w:asciiTheme="majorHAnsi" w:hAnsiTheme="majorHAnsi" w:cstheme="majorHAnsi"/>
-          <w:b/>
-          <w:bCs/>
-          <w:color w:val="2E74B5"/>
-          <w:sz w:val="28"/>
-          <w:szCs w:val="28"/>
-        </w:rPr>
-      </w:r>
     </w:p>
     <w:p>
       <w:pPr>
@@ -4089,929 +3426,25 @@
         </w:rPr>
       </w:pPr>
     </w:p>
-    <w:tbl>
-      <w:tblPr>
-        <w:tblW w:w="9360" w:type="dxa"/>
-        <w:tblBorders>
-          <w:top w:val="single" w:sz="4" w:space="0" w:color="auto"/>
-          <w:left w:val="single" w:sz="4" w:space="0" w:color="auto"/>
-          <w:bottom w:val="single" w:sz="4" w:space="0" w:color="auto"/>
-          <w:right w:val="single" w:sz="4" w:space="0" w:color="auto"/>
-          <w:insideH w:val="single" w:sz="4" w:space="0" w:color="auto"/>
-          <w:insideV w:val="single" w:sz="4" w:space="0" w:color="auto"/>
-        </w:tblBorders>
-        <w:tblCellMar>
-          <w:left w:w="10" w:type="dxa"/>
-          <w:right w:w="10" w:type="dxa"/>
-        </w:tblCellMar>
-        <w:tblLook w:val="04A0" w:firstRow="1" w:lastRow="0" w:firstColumn="1" w:lastColumn="0" w:noHBand="0" w:noVBand="1"/>
-      </w:tblPr>
-      <w:tblGrid>
-        <w:gridCol w:w="3120"/>
-        <w:gridCol w:w="3120"/>
-        <w:gridCol w:w="3120"/>
-      </w:tblGrid>
-      <w:tr>
-        <w:tblPrEx>
-          <w:tblCellMar>
-            <w:top w:w="0" w:type="dxa"/>
-            <w:bottom w:w="0" w:type="dxa"/>
-          </w:tblCellMar>
-        </w:tblPrEx>
-        <w:tc>
-          <w:tcPr>
-            <w:tcW w:w="3120" w:type="dxa"/>
-            <w:tcBorders>
-              <w:top w:val="single" w:sz="1" w:space="0" w:color="CCCCCC"/>
-              <w:left w:val="single" w:sz="1" w:space="0" w:color="CCCCCC"/>
-              <w:bottom w:val="single" w:sz="1" w:space="0" w:color="CCCCCC"/>
-              <w:right w:val="single" w:sz="1" w:space="0" w:color="CCCCCC"/>
-            </w:tcBorders>
-            <w:shd w:val="clear" w:color="auto" w:fill="1F4E79"/>
-            <w:tcMar>
-              <w:top w:w="100" w:type="dxa"/>
-              <w:left w:w="150" w:type="dxa"/>
-              <w:bottom w:w="100" w:type="dxa"/>
-              <w:right w:w="150" w:type="dxa"/>
-            </w:tcMar>
-            <w:vAlign w:val="center"/>
-          </w:tcPr>
-          <w:p>
-            <w:pPr>
-              <w:spacing w:line="276" w:lineRule="auto"/>
-              <w:contextualSpacing/>
-              <w:jc w:val="center"/>
-              <w:rPr>
-                <w:rFonts w:asciiTheme="majorHAnsi" w:hAnsiTheme="majorHAnsi" w:cstheme="majorHAnsi"/>
-                <w:sz w:val="28"/>
-                <w:szCs w:val="28"/>
-              </w:rPr>
-            </w:pPr>
-            <w:r>
-              <w:rPr>
-                <w:rFonts w:asciiTheme="majorHAnsi" w:hAnsiTheme="majorHAnsi" w:cstheme="majorHAnsi"/>
-                <w:b/>
-                <w:bCs/>
-                <w:color w:val="FFFFFF"/>
-                <w:sz w:val="28"/>
-                <w:szCs w:val="28"/>
-              </w:rPr>
-              <w:t>Tiêu chí</w:t>
-            </w:r>
-          </w:p>
-        </w:tc>
-        <w:tc>
-          <w:tcPr>
-            <w:tcW w:w="3120" w:type="dxa"/>
-            <w:tcBorders>
-              <w:top w:val="single" w:sz="1" w:space="0" w:color="CCCCCC"/>
-              <w:left w:val="single" w:sz="1" w:space="0" w:color="CCCCCC"/>
-              <w:bottom w:val="single" w:sz="1" w:space="0" w:color="CCCCCC"/>
-              <w:right w:val="single" w:sz="1" w:space="0" w:color="CCCCCC"/>
-            </w:tcBorders>
-            <w:shd w:val="clear" w:color="auto" w:fill="1F4E79"/>
-            <w:tcMar>
-              <w:top w:w="100" w:type="dxa"/>
-              <w:left w:w="150" w:type="dxa"/>
-              <w:bottom w:w="100" w:type="dxa"/>
-              <w:right w:w="150" w:type="dxa"/>
-            </w:tcMar>
-            <w:vAlign w:val="center"/>
-          </w:tcPr>
-          <w:p>
-            <w:pPr>
-              <w:spacing w:line="276" w:lineRule="auto"/>
-              <w:contextualSpacing/>
-              <w:jc w:val="center"/>
-              <w:rPr>
-                <w:rFonts w:asciiTheme="majorHAnsi" w:hAnsiTheme="majorHAnsi" w:cstheme="majorHAnsi"/>
-                <w:sz w:val="28"/>
-                <w:szCs w:val="28"/>
-              </w:rPr>
-            </w:pPr>
-            <w:r>
-              <w:rPr>
-                <w:rFonts w:asciiTheme="majorHAnsi" w:hAnsiTheme="majorHAnsi" w:cstheme="majorHAnsi"/>
-                <w:b/>
-                <w:bCs/>
-                <w:color w:val="FFFFFF"/>
-                <w:sz w:val="28"/>
-                <w:szCs w:val="28"/>
-              </w:rPr>
-              <w:t>Tìm kiếm Nhị Phân</w:t>
-            </w:r>
-          </w:p>
-        </w:tc>
-        <w:tc>
-          <w:tcPr>
-            <w:tcW w:w="3120" w:type="dxa"/>
-            <w:tcBorders>
-              <w:top w:val="single" w:sz="1" w:space="0" w:color="CCCCCC"/>
-              <w:left w:val="single" w:sz="1" w:space="0" w:color="CCCCCC"/>
-              <w:bottom w:val="single" w:sz="1" w:space="0" w:color="CCCCCC"/>
-              <w:right w:val="single" w:sz="1" w:space="0" w:color="CCCCCC"/>
-            </w:tcBorders>
-            <w:shd w:val="clear" w:color="auto" w:fill="1F4E79"/>
-            <w:tcMar>
-              <w:top w:w="100" w:type="dxa"/>
-              <w:left w:w="150" w:type="dxa"/>
-              <w:bottom w:w="100" w:type="dxa"/>
-              <w:right w:w="150" w:type="dxa"/>
-            </w:tcMar>
-            <w:vAlign w:val="center"/>
-          </w:tcPr>
-          <w:p>
-            <w:pPr>
-              <w:spacing w:line="276" w:lineRule="auto"/>
-              <w:contextualSpacing/>
-              <w:jc w:val="center"/>
-              <w:rPr>
-                <w:rFonts w:asciiTheme="majorHAnsi" w:hAnsiTheme="majorHAnsi" w:cstheme="majorHAnsi"/>
-                <w:sz w:val="28"/>
-                <w:szCs w:val="28"/>
-              </w:rPr>
-            </w:pPr>
-            <w:r>
-              <w:rPr>
-                <w:rFonts w:asciiTheme="majorHAnsi" w:hAnsiTheme="majorHAnsi" w:cstheme="majorHAnsi"/>
-                <w:b/>
-                <w:bCs/>
-                <w:color w:val="FFFFFF"/>
-                <w:sz w:val="28"/>
-                <w:szCs w:val="28"/>
-              </w:rPr>
-              <w:t>Tìm kiếm Tuần Tự</w:t>
-            </w:r>
-          </w:p>
-        </w:tc>
-      </w:tr>
-      <w:tr>
-        <w:tblPrEx>
-          <w:tblCellMar>
-            <w:top w:w="0" w:type="dxa"/>
-            <w:bottom w:w="0" w:type="dxa"/>
-          </w:tblCellMar>
-        </w:tblPrEx>
-        <w:tc>
-          <w:tcPr>
-            <w:tcW w:w="3120" w:type="dxa"/>
-            <w:tcBorders>
-              <w:top w:val="single" w:sz="1" w:space="0" w:color="CCCCCC"/>
-              <w:left w:val="single" w:sz="1" w:space="0" w:color="CCCCCC"/>
-              <w:bottom w:val="single" w:sz="1" w:space="0" w:color="CCCCCC"/>
-              <w:right w:val="single" w:sz="1" w:space="0" w:color="CCCCCC"/>
-            </w:tcBorders>
-            <w:shd w:val="clear" w:color="auto" w:fill="DEEAF1"/>
-            <w:tcMar>
-              <w:top w:w="80" w:type="dxa"/>
-              <w:left w:w="150" w:type="dxa"/>
-              <w:bottom w:w="80" w:type="dxa"/>
-              <w:right w:w="150" w:type="dxa"/>
-            </w:tcMar>
-          </w:tcPr>
-          <w:p>
-            <w:pPr>
-              <w:spacing w:line="276" w:lineRule="auto"/>
-              <w:contextualSpacing/>
-              <w:jc w:val="center"/>
-              <w:rPr>
-                <w:rFonts w:asciiTheme="majorHAnsi" w:hAnsiTheme="majorHAnsi" w:cstheme="majorHAnsi"/>
-                <w:sz w:val="28"/>
-                <w:szCs w:val="28"/>
-              </w:rPr>
-            </w:pPr>
-            <w:r>
-              <w:rPr>
-                <w:rFonts w:asciiTheme="majorHAnsi" w:hAnsiTheme="majorHAnsi" w:cstheme="majorHAnsi"/>
-                <w:b/>
-                <w:bCs/>
-                <w:sz w:val="28"/>
-                <w:szCs w:val="28"/>
-              </w:rPr>
-              <w:t>Điều kiện đầu vào</w:t>
-            </w:r>
-          </w:p>
-        </w:tc>
-        <w:tc>
-          <w:tcPr>
-            <w:tcW w:w="3120" w:type="dxa"/>
-            <w:tcBorders>
-              <w:top w:val="single" w:sz="1" w:space="0" w:color="CCCCCC"/>
-              <w:left w:val="single" w:sz="1" w:space="0" w:color="CCCCCC"/>
-              <w:bottom w:val="single" w:sz="1" w:space="0" w:color="CCCCCC"/>
-              <w:right w:val="single" w:sz="1" w:space="0" w:color="CCCCCC"/>
-            </w:tcBorders>
-            <w:shd w:val="clear" w:color="auto" w:fill="DEEAF1"/>
-            <w:tcMar>
-              <w:top w:w="80" w:type="dxa"/>
-              <w:left w:w="150" w:type="dxa"/>
-              <w:bottom w:w="80" w:type="dxa"/>
-              <w:right w:w="150" w:type="dxa"/>
-            </w:tcMar>
-          </w:tcPr>
-          <w:p>
-            <w:pPr>
-              <w:spacing w:line="276" w:lineRule="auto"/>
-              <w:contextualSpacing/>
-              <w:jc w:val="center"/>
-              <w:rPr>
-                <w:rFonts w:asciiTheme="majorHAnsi" w:hAnsiTheme="majorHAnsi" w:cstheme="majorHAnsi"/>
-                <w:sz w:val="28"/>
-                <w:szCs w:val="28"/>
-              </w:rPr>
-            </w:pPr>
-            <w:r>
-              <w:rPr>
-                <w:rFonts w:asciiTheme="majorHAnsi" w:hAnsiTheme="majorHAnsi" w:cstheme="majorHAnsi"/>
-                <w:sz w:val="28"/>
-                <w:szCs w:val="28"/>
-              </w:rPr>
-              <w:t>Mảng phải sắp xếp tăng dần</w:t>
-            </w:r>
-          </w:p>
-        </w:tc>
-        <w:tc>
-          <w:tcPr>
-            <w:tcW w:w="3120" w:type="dxa"/>
-            <w:tcBorders>
-              <w:top w:val="single" w:sz="1" w:space="0" w:color="CCCCCC"/>
-              <w:left w:val="single" w:sz="1" w:space="0" w:color="CCCCCC"/>
-              <w:bottom w:val="single" w:sz="1" w:space="0" w:color="CCCCCC"/>
-              <w:right w:val="single" w:sz="1" w:space="0" w:color="CCCCCC"/>
-            </w:tcBorders>
-            <w:shd w:val="clear" w:color="auto" w:fill="DEEAF1"/>
-            <w:tcMar>
-              <w:top w:w="80" w:type="dxa"/>
-              <w:left w:w="150" w:type="dxa"/>
-              <w:bottom w:w="80" w:type="dxa"/>
-              <w:right w:w="150" w:type="dxa"/>
-            </w:tcMar>
-          </w:tcPr>
-          <w:p>
-            <w:pPr>
-              <w:spacing w:line="276" w:lineRule="auto"/>
-              <w:contextualSpacing/>
-              <w:jc w:val="center"/>
-              <w:rPr>
-                <w:rFonts w:asciiTheme="majorHAnsi" w:hAnsiTheme="majorHAnsi" w:cstheme="majorHAnsi"/>
-                <w:sz w:val="28"/>
-                <w:szCs w:val="28"/>
-              </w:rPr>
-            </w:pPr>
-            <w:r>
-              <w:rPr>
-                <w:rFonts w:asciiTheme="majorHAnsi" w:hAnsiTheme="majorHAnsi" w:cstheme="majorHAnsi"/>
-                <w:sz w:val="28"/>
-                <w:szCs w:val="28"/>
-              </w:rPr>
-              <w:t>Không yêu cầu sắp xếp</w:t>
-            </w:r>
-          </w:p>
-        </w:tc>
-      </w:tr>
-      <w:tr>
-        <w:tblPrEx>
-          <w:tblCellMar>
-            <w:top w:w="0" w:type="dxa"/>
-            <w:bottom w:w="0" w:type="dxa"/>
-          </w:tblCellMar>
-        </w:tblPrEx>
-        <w:tc>
-          <w:tcPr>
-            <w:tcW w:w="3120" w:type="dxa"/>
-            <w:tcBorders>
-              <w:top w:val="single" w:sz="1" w:space="0" w:color="CCCCCC"/>
-              <w:left w:val="single" w:sz="1" w:space="0" w:color="CCCCCC"/>
-              <w:bottom w:val="single" w:sz="1" w:space="0" w:color="CCCCCC"/>
-              <w:right w:val="single" w:sz="1" w:space="0" w:color="CCCCCC"/>
-            </w:tcBorders>
-            <w:shd w:val="clear" w:color="auto" w:fill="FFFFFF"/>
-            <w:tcMar>
-              <w:top w:w="80" w:type="dxa"/>
-              <w:left w:w="150" w:type="dxa"/>
-              <w:bottom w:w="80" w:type="dxa"/>
-              <w:right w:w="150" w:type="dxa"/>
-            </w:tcMar>
-          </w:tcPr>
-          <w:p>
-            <w:pPr>
-              <w:spacing w:line="276" w:lineRule="auto"/>
-              <w:contextualSpacing/>
-              <w:jc w:val="center"/>
-              <w:rPr>
-                <w:rFonts w:asciiTheme="majorHAnsi" w:hAnsiTheme="majorHAnsi" w:cstheme="majorHAnsi"/>
-                <w:sz w:val="28"/>
-                <w:szCs w:val="28"/>
-              </w:rPr>
-            </w:pPr>
-            <w:r>
-              <w:rPr>
-                <w:rFonts w:asciiTheme="majorHAnsi" w:hAnsiTheme="majorHAnsi" w:cstheme="majorHAnsi"/>
-                <w:b/>
-                <w:bCs/>
-                <w:sz w:val="28"/>
-                <w:szCs w:val="28"/>
-              </w:rPr>
-              <w:t>Nguyên lý</w:t>
-            </w:r>
-          </w:p>
-        </w:tc>
-        <w:tc>
-          <w:tcPr>
-            <w:tcW w:w="3120" w:type="dxa"/>
-            <w:tcBorders>
-              <w:top w:val="single" w:sz="1" w:space="0" w:color="CCCCCC"/>
-              <w:left w:val="single" w:sz="1" w:space="0" w:color="CCCCCC"/>
-              <w:bottom w:val="single" w:sz="1" w:space="0" w:color="CCCCCC"/>
-              <w:right w:val="single" w:sz="1" w:space="0" w:color="CCCCCC"/>
-            </w:tcBorders>
-            <w:shd w:val="clear" w:color="auto" w:fill="FFFFFF"/>
-            <w:tcMar>
-              <w:top w:w="80" w:type="dxa"/>
-              <w:left w:w="150" w:type="dxa"/>
-              <w:bottom w:w="80" w:type="dxa"/>
-              <w:right w:w="150" w:type="dxa"/>
-            </w:tcMar>
-          </w:tcPr>
-          <w:p>
-            <w:pPr>
-              <w:spacing w:line="276" w:lineRule="auto"/>
-              <w:contextualSpacing/>
-              <w:jc w:val="center"/>
-              <w:rPr>
-                <w:rFonts w:asciiTheme="majorHAnsi" w:hAnsiTheme="majorHAnsi" w:cstheme="majorHAnsi"/>
-                <w:sz w:val="28"/>
-                <w:szCs w:val="28"/>
-              </w:rPr>
-            </w:pPr>
-            <w:r>
-              <w:rPr>
-                <w:rFonts w:asciiTheme="majorHAnsi" w:hAnsiTheme="majorHAnsi" w:cstheme="majorHAnsi"/>
-                <w:sz w:val="28"/>
-                <w:szCs w:val="28"/>
-              </w:rPr>
-              <w:t>Chia đôi vùng tìm kiếm qua mỗi bước</w:t>
-            </w:r>
-          </w:p>
-        </w:tc>
-        <w:tc>
-          <w:tcPr>
-            <w:tcW w:w="3120" w:type="dxa"/>
-            <w:tcBorders>
-              <w:top w:val="single" w:sz="1" w:space="0" w:color="CCCCCC"/>
-              <w:left w:val="single" w:sz="1" w:space="0" w:color="CCCCCC"/>
-              <w:bottom w:val="single" w:sz="1" w:space="0" w:color="CCCCCC"/>
-              <w:right w:val="single" w:sz="1" w:space="0" w:color="CCCCCC"/>
-            </w:tcBorders>
-            <w:shd w:val="clear" w:color="auto" w:fill="FFFFFF"/>
-            <w:tcMar>
-              <w:top w:w="80" w:type="dxa"/>
-              <w:left w:w="150" w:type="dxa"/>
-              <w:bottom w:w="80" w:type="dxa"/>
-              <w:right w:w="150" w:type="dxa"/>
-            </w:tcMar>
-          </w:tcPr>
-          <w:p>
-            <w:pPr>
-              <w:spacing w:line="276" w:lineRule="auto"/>
-              <w:contextualSpacing/>
-              <w:jc w:val="center"/>
-              <w:rPr>
-                <w:rFonts w:asciiTheme="majorHAnsi" w:hAnsiTheme="majorHAnsi" w:cstheme="majorHAnsi"/>
-                <w:sz w:val="28"/>
-                <w:szCs w:val="28"/>
-              </w:rPr>
-            </w:pPr>
-            <w:r>
-              <w:rPr>
-                <w:rFonts w:asciiTheme="majorHAnsi" w:hAnsiTheme="majorHAnsi" w:cstheme="majorHAnsi"/>
-                <w:sz w:val="28"/>
-                <w:szCs w:val="28"/>
-              </w:rPr>
-              <w:t>Duyệt tuần tự từng phần tử</w:t>
-            </w:r>
-          </w:p>
-        </w:tc>
-      </w:tr>
-      <w:tr>
-        <w:tblPrEx>
-          <w:tblCellMar>
-            <w:top w:w="0" w:type="dxa"/>
-            <w:bottom w:w="0" w:type="dxa"/>
-          </w:tblCellMar>
-        </w:tblPrEx>
-        <w:tc>
-          <w:tcPr>
-            <w:tcW w:w="3120" w:type="dxa"/>
-            <w:tcBorders>
-              <w:top w:val="single" w:sz="1" w:space="0" w:color="CCCCCC"/>
-              <w:left w:val="single" w:sz="1" w:space="0" w:color="CCCCCC"/>
-              <w:bottom w:val="single" w:sz="1" w:space="0" w:color="CCCCCC"/>
-              <w:right w:val="single" w:sz="1" w:space="0" w:color="CCCCCC"/>
-            </w:tcBorders>
-            <w:shd w:val="clear" w:color="auto" w:fill="DEEAF1"/>
-            <w:tcMar>
-              <w:top w:w="80" w:type="dxa"/>
-              <w:left w:w="150" w:type="dxa"/>
-              <w:bottom w:w="80" w:type="dxa"/>
-              <w:right w:w="150" w:type="dxa"/>
-            </w:tcMar>
-          </w:tcPr>
-          <w:p>
-            <w:pPr>
-              <w:spacing w:line="276" w:lineRule="auto"/>
-              <w:contextualSpacing/>
-              <w:jc w:val="center"/>
-              <w:rPr>
-                <w:rFonts w:asciiTheme="majorHAnsi" w:hAnsiTheme="majorHAnsi" w:cstheme="majorHAnsi"/>
-                <w:sz w:val="28"/>
-                <w:szCs w:val="28"/>
-              </w:rPr>
-            </w:pPr>
-            <w:r>
-              <w:rPr>
-                <w:rFonts w:asciiTheme="majorHAnsi" w:hAnsiTheme="majorHAnsi" w:cstheme="majorHAnsi"/>
-                <w:b/>
-                <w:bCs/>
-                <w:sz w:val="28"/>
-                <w:szCs w:val="28"/>
-              </w:rPr>
-              <w:t>Độ phức tạp</w:t>
-            </w:r>
-          </w:p>
-        </w:tc>
-        <w:tc>
-          <w:tcPr>
-            <w:tcW w:w="3120" w:type="dxa"/>
-            <w:tcBorders>
-              <w:top w:val="single" w:sz="1" w:space="0" w:color="CCCCCC"/>
-              <w:left w:val="single" w:sz="1" w:space="0" w:color="CCCCCC"/>
-              <w:bottom w:val="single" w:sz="1" w:space="0" w:color="CCCCCC"/>
-              <w:right w:val="single" w:sz="1" w:space="0" w:color="CCCCCC"/>
-            </w:tcBorders>
-            <w:shd w:val="clear" w:color="auto" w:fill="DEEAF1"/>
-            <w:tcMar>
-              <w:top w:w="80" w:type="dxa"/>
-              <w:left w:w="150" w:type="dxa"/>
-              <w:bottom w:w="80" w:type="dxa"/>
-              <w:right w:w="150" w:type="dxa"/>
-            </w:tcMar>
-          </w:tcPr>
-          <w:p>
-            <w:pPr>
-              <w:spacing w:line="276" w:lineRule="auto"/>
-              <w:contextualSpacing/>
-              <w:jc w:val="center"/>
-              <w:rPr>
-                <w:rFonts w:asciiTheme="majorHAnsi" w:hAnsiTheme="majorHAnsi" w:cstheme="majorHAnsi"/>
-                <w:sz w:val="28"/>
-                <w:szCs w:val="28"/>
-              </w:rPr>
-            </w:pPr>
-            <w:r>
-              <w:rPr>
-                <w:rFonts w:asciiTheme="majorHAnsi" w:hAnsiTheme="majorHAnsi" w:cstheme="majorHAnsi"/>
-                <w:sz w:val="28"/>
-                <w:szCs w:val="28"/>
-              </w:rPr>
-              <w:t>O(log₂ n)</w:t>
-            </w:r>
-          </w:p>
-        </w:tc>
-        <w:tc>
-          <w:tcPr>
-            <w:tcW w:w="3120" w:type="dxa"/>
-            <w:tcBorders>
-              <w:top w:val="single" w:sz="1" w:space="0" w:color="CCCCCC"/>
-              <w:left w:val="single" w:sz="1" w:space="0" w:color="CCCCCC"/>
-              <w:bottom w:val="single" w:sz="1" w:space="0" w:color="CCCCCC"/>
-              <w:right w:val="single" w:sz="1" w:space="0" w:color="CCCCCC"/>
-            </w:tcBorders>
-            <w:shd w:val="clear" w:color="auto" w:fill="DEEAF1"/>
-            <w:tcMar>
-              <w:top w:w="80" w:type="dxa"/>
-              <w:left w:w="150" w:type="dxa"/>
-              <w:bottom w:w="80" w:type="dxa"/>
-              <w:right w:w="150" w:type="dxa"/>
-            </w:tcMar>
-          </w:tcPr>
-          <w:p>
-            <w:pPr>
-              <w:spacing w:line="276" w:lineRule="auto"/>
-              <w:contextualSpacing/>
-              <w:jc w:val="center"/>
-              <w:rPr>
-                <w:rFonts w:asciiTheme="majorHAnsi" w:hAnsiTheme="majorHAnsi" w:cstheme="majorHAnsi"/>
-                <w:sz w:val="28"/>
-                <w:szCs w:val="28"/>
-              </w:rPr>
-            </w:pPr>
-            <w:r>
-              <w:rPr>
-                <w:rFonts w:asciiTheme="majorHAnsi" w:hAnsiTheme="majorHAnsi" w:cstheme="majorHAnsi"/>
-                <w:sz w:val="28"/>
-                <w:szCs w:val="28"/>
-              </w:rPr>
-              <w:t>O(n)</w:t>
-            </w:r>
-          </w:p>
-        </w:tc>
-      </w:tr>
-      <w:tr>
-        <w:tblPrEx>
-          <w:tblCellMar>
-            <w:top w:w="0" w:type="dxa"/>
-            <w:bottom w:w="0" w:type="dxa"/>
-          </w:tblCellMar>
-        </w:tblPrEx>
-        <w:tc>
-          <w:tcPr>
-            <w:tcW w:w="3120" w:type="dxa"/>
-            <w:tcBorders>
-              <w:top w:val="single" w:sz="1" w:space="0" w:color="CCCCCC"/>
-              <w:left w:val="single" w:sz="1" w:space="0" w:color="CCCCCC"/>
-              <w:bottom w:val="single" w:sz="1" w:space="0" w:color="CCCCCC"/>
-              <w:right w:val="single" w:sz="1" w:space="0" w:color="CCCCCC"/>
-            </w:tcBorders>
-            <w:shd w:val="clear" w:color="auto" w:fill="FFFFFF"/>
-            <w:tcMar>
-              <w:top w:w="80" w:type="dxa"/>
-              <w:left w:w="150" w:type="dxa"/>
-              <w:bottom w:w="80" w:type="dxa"/>
-              <w:right w:w="150" w:type="dxa"/>
-            </w:tcMar>
-          </w:tcPr>
-          <w:p>
-            <w:pPr>
-              <w:spacing w:line="276" w:lineRule="auto"/>
-              <w:contextualSpacing/>
-              <w:jc w:val="center"/>
-              <w:rPr>
-                <w:rFonts w:asciiTheme="majorHAnsi" w:hAnsiTheme="majorHAnsi" w:cstheme="majorHAnsi"/>
-                <w:sz w:val="28"/>
-                <w:szCs w:val="28"/>
-              </w:rPr>
-            </w:pPr>
-            <w:r>
-              <w:rPr>
-                <w:rFonts w:asciiTheme="majorHAnsi" w:hAnsiTheme="majorHAnsi" w:cstheme="majorHAnsi"/>
-                <w:b/>
-                <w:bCs/>
-                <w:sz w:val="28"/>
-                <w:szCs w:val="28"/>
-              </w:rPr>
-              <w:t>n = 1.000</w:t>
-            </w:r>
-          </w:p>
-        </w:tc>
-        <w:tc>
-          <w:tcPr>
-            <w:tcW w:w="3120" w:type="dxa"/>
-            <w:tcBorders>
-              <w:top w:val="single" w:sz="1" w:space="0" w:color="CCCCCC"/>
-              <w:left w:val="single" w:sz="1" w:space="0" w:color="CCCCCC"/>
-              <w:bottom w:val="single" w:sz="1" w:space="0" w:color="CCCCCC"/>
-              <w:right w:val="single" w:sz="1" w:space="0" w:color="CCCCCC"/>
-            </w:tcBorders>
-            <w:shd w:val="clear" w:color="auto" w:fill="FFFFFF"/>
-            <w:tcMar>
-              <w:top w:w="80" w:type="dxa"/>
-              <w:left w:w="150" w:type="dxa"/>
-              <w:bottom w:w="80" w:type="dxa"/>
-              <w:right w:w="150" w:type="dxa"/>
-            </w:tcMar>
-          </w:tcPr>
-          <w:p>
-            <w:pPr>
-              <w:spacing w:line="276" w:lineRule="auto"/>
-              <w:contextualSpacing/>
-              <w:jc w:val="center"/>
-              <w:rPr>
-                <w:rFonts w:asciiTheme="majorHAnsi" w:hAnsiTheme="majorHAnsi" w:cstheme="majorHAnsi"/>
-                <w:sz w:val="28"/>
-                <w:szCs w:val="28"/>
-              </w:rPr>
-            </w:pPr>
-            <w:r>
-              <w:rPr>
-                <w:rFonts w:asciiTheme="majorHAnsi" w:hAnsiTheme="majorHAnsi" w:cstheme="majorHAnsi"/>
-                <w:sz w:val="28"/>
-                <w:szCs w:val="28"/>
-              </w:rPr>
-              <w:t>≤ 10 bước</w:t>
-            </w:r>
-          </w:p>
-        </w:tc>
-        <w:tc>
-          <w:tcPr>
-            <w:tcW w:w="3120" w:type="dxa"/>
-            <w:tcBorders>
-              <w:top w:val="single" w:sz="1" w:space="0" w:color="CCCCCC"/>
-              <w:left w:val="single" w:sz="1" w:space="0" w:color="CCCCCC"/>
-              <w:bottom w:val="single" w:sz="1" w:space="0" w:color="CCCCCC"/>
-              <w:right w:val="single" w:sz="1" w:space="0" w:color="CCCCCC"/>
-            </w:tcBorders>
-            <w:shd w:val="clear" w:color="auto" w:fill="FFFFFF"/>
-            <w:tcMar>
-              <w:top w:w="80" w:type="dxa"/>
-              <w:left w:w="150" w:type="dxa"/>
-              <w:bottom w:w="80" w:type="dxa"/>
-              <w:right w:w="150" w:type="dxa"/>
-            </w:tcMar>
-          </w:tcPr>
-          <w:p>
-            <w:pPr>
-              <w:spacing w:line="276" w:lineRule="auto"/>
-              <w:contextualSpacing/>
-              <w:jc w:val="center"/>
-              <w:rPr>
-                <w:rFonts w:asciiTheme="majorHAnsi" w:hAnsiTheme="majorHAnsi" w:cstheme="majorHAnsi"/>
-                <w:sz w:val="28"/>
-                <w:szCs w:val="28"/>
-              </w:rPr>
-            </w:pPr>
-            <w:r>
-              <w:rPr>
-                <w:rFonts w:asciiTheme="majorHAnsi" w:hAnsiTheme="majorHAnsi" w:cstheme="majorHAnsi"/>
-                <w:sz w:val="28"/>
-                <w:szCs w:val="28"/>
-              </w:rPr>
-              <w:t>≤ 1.000 bước</w:t>
-            </w:r>
-          </w:p>
-        </w:tc>
-      </w:tr>
-      <w:tr>
-        <w:tblPrEx>
-          <w:tblCellMar>
-            <w:top w:w="0" w:type="dxa"/>
-            <w:bottom w:w="0" w:type="dxa"/>
-          </w:tblCellMar>
-        </w:tblPrEx>
-        <w:tc>
-          <w:tcPr>
-            <w:tcW w:w="3120" w:type="dxa"/>
-            <w:tcBorders>
-              <w:top w:val="single" w:sz="1" w:space="0" w:color="CCCCCC"/>
-              <w:left w:val="single" w:sz="1" w:space="0" w:color="CCCCCC"/>
-              <w:bottom w:val="single" w:sz="1" w:space="0" w:color="CCCCCC"/>
-              <w:right w:val="single" w:sz="1" w:space="0" w:color="CCCCCC"/>
-            </w:tcBorders>
-            <w:shd w:val="clear" w:color="auto" w:fill="DEEAF1"/>
-            <w:tcMar>
-              <w:top w:w="80" w:type="dxa"/>
-              <w:left w:w="150" w:type="dxa"/>
-              <w:bottom w:w="80" w:type="dxa"/>
-              <w:right w:w="150" w:type="dxa"/>
-            </w:tcMar>
-          </w:tcPr>
-          <w:p>
-            <w:pPr>
-              <w:spacing w:line="276" w:lineRule="auto"/>
-              <w:contextualSpacing/>
-              <w:jc w:val="center"/>
-              <w:rPr>
-                <w:rFonts w:asciiTheme="majorHAnsi" w:hAnsiTheme="majorHAnsi" w:cstheme="majorHAnsi"/>
-                <w:sz w:val="28"/>
-                <w:szCs w:val="28"/>
-              </w:rPr>
-            </w:pPr>
-            <w:r>
-              <w:rPr>
-                <w:rFonts w:asciiTheme="majorHAnsi" w:hAnsiTheme="majorHAnsi" w:cstheme="majorHAnsi"/>
-                <w:b/>
-                <w:bCs/>
-                <w:sz w:val="28"/>
-                <w:szCs w:val="28"/>
-              </w:rPr>
-              <w:t>n = 1.000.000</w:t>
-            </w:r>
-          </w:p>
-        </w:tc>
-        <w:tc>
-          <w:tcPr>
-            <w:tcW w:w="3120" w:type="dxa"/>
-            <w:tcBorders>
-              <w:top w:val="single" w:sz="1" w:space="0" w:color="CCCCCC"/>
-              <w:left w:val="single" w:sz="1" w:space="0" w:color="CCCCCC"/>
-              <w:bottom w:val="single" w:sz="1" w:space="0" w:color="CCCCCC"/>
-              <w:right w:val="single" w:sz="1" w:space="0" w:color="CCCCCC"/>
-            </w:tcBorders>
-            <w:shd w:val="clear" w:color="auto" w:fill="DEEAF1"/>
-            <w:tcMar>
-              <w:top w:w="80" w:type="dxa"/>
-              <w:left w:w="150" w:type="dxa"/>
-              <w:bottom w:w="80" w:type="dxa"/>
-              <w:right w:w="150" w:type="dxa"/>
-            </w:tcMar>
-          </w:tcPr>
-          <w:p>
-            <w:pPr>
-              <w:spacing w:line="276" w:lineRule="auto"/>
-              <w:contextualSpacing/>
-              <w:jc w:val="center"/>
-              <w:rPr>
-                <w:rFonts w:asciiTheme="majorHAnsi" w:hAnsiTheme="majorHAnsi" w:cstheme="majorHAnsi"/>
-                <w:sz w:val="28"/>
-                <w:szCs w:val="28"/>
-              </w:rPr>
-            </w:pPr>
-            <w:r>
-              <w:rPr>
-                <w:rFonts w:asciiTheme="majorHAnsi" w:hAnsiTheme="majorHAnsi" w:cstheme="majorHAnsi"/>
-                <w:sz w:val="28"/>
-                <w:szCs w:val="28"/>
-              </w:rPr>
-              <w:t>≤ 20 bước</w:t>
-            </w:r>
-          </w:p>
-        </w:tc>
-        <w:tc>
-          <w:tcPr>
-            <w:tcW w:w="3120" w:type="dxa"/>
-            <w:tcBorders>
-              <w:top w:val="single" w:sz="1" w:space="0" w:color="CCCCCC"/>
-              <w:left w:val="single" w:sz="1" w:space="0" w:color="CCCCCC"/>
-              <w:bottom w:val="single" w:sz="1" w:space="0" w:color="CCCCCC"/>
-              <w:right w:val="single" w:sz="1" w:space="0" w:color="CCCCCC"/>
-            </w:tcBorders>
-            <w:shd w:val="clear" w:color="auto" w:fill="DEEAF1"/>
-            <w:tcMar>
-              <w:top w:w="80" w:type="dxa"/>
-              <w:left w:w="150" w:type="dxa"/>
-              <w:bottom w:w="80" w:type="dxa"/>
-              <w:right w:w="150" w:type="dxa"/>
-            </w:tcMar>
-          </w:tcPr>
-          <w:p>
-            <w:pPr>
-              <w:spacing w:line="276" w:lineRule="auto"/>
-              <w:contextualSpacing/>
-              <w:jc w:val="center"/>
-              <w:rPr>
-                <w:rFonts w:asciiTheme="majorHAnsi" w:hAnsiTheme="majorHAnsi" w:cstheme="majorHAnsi"/>
-                <w:sz w:val="28"/>
-                <w:szCs w:val="28"/>
-              </w:rPr>
-            </w:pPr>
-            <w:r>
-              <w:rPr>
-                <w:rFonts w:asciiTheme="majorHAnsi" w:hAnsiTheme="majorHAnsi" w:cstheme="majorHAnsi"/>
-                <w:sz w:val="28"/>
-                <w:szCs w:val="28"/>
-              </w:rPr>
-              <w:t>≤ 1.000.000 bước</w:t>
-            </w:r>
-          </w:p>
-        </w:tc>
-      </w:tr>
-      <w:tr>
-        <w:tblPrEx>
-          <w:tblCellMar>
-            <w:top w:w="0" w:type="dxa"/>
-            <w:bottom w:w="0" w:type="dxa"/>
-          </w:tblCellMar>
-        </w:tblPrEx>
-        <w:tc>
-          <w:tcPr>
-            <w:tcW w:w="3120" w:type="dxa"/>
-            <w:tcBorders>
-              <w:top w:val="single" w:sz="1" w:space="0" w:color="CCCCCC"/>
-              <w:left w:val="single" w:sz="1" w:space="0" w:color="CCCCCC"/>
-              <w:bottom w:val="single" w:sz="1" w:space="0" w:color="CCCCCC"/>
-              <w:right w:val="single" w:sz="1" w:space="0" w:color="CCCCCC"/>
-            </w:tcBorders>
-            <w:shd w:val="clear" w:color="auto" w:fill="FFFFFF"/>
-            <w:tcMar>
-              <w:top w:w="80" w:type="dxa"/>
-              <w:left w:w="150" w:type="dxa"/>
-              <w:bottom w:w="80" w:type="dxa"/>
-              <w:right w:w="150" w:type="dxa"/>
-            </w:tcMar>
-          </w:tcPr>
-          <w:p>
-            <w:pPr>
-              <w:spacing w:line="276" w:lineRule="auto"/>
-              <w:contextualSpacing/>
-              <w:jc w:val="center"/>
-              <w:rPr>
-                <w:rFonts w:asciiTheme="majorHAnsi" w:hAnsiTheme="majorHAnsi" w:cstheme="majorHAnsi"/>
-                <w:sz w:val="28"/>
-                <w:szCs w:val="28"/>
-              </w:rPr>
-            </w:pPr>
-            <w:r>
-              <w:rPr>
-                <w:rFonts w:asciiTheme="majorHAnsi" w:hAnsiTheme="majorHAnsi" w:cstheme="majorHAnsi"/>
-                <w:b/>
-                <w:bCs/>
-                <w:sz w:val="28"/>
-                <w:szCs w:val="28"/>
-              </w:rPr>
-              <w:t>Ứng dụng thực tế</w:t>
-            </w:r>
-          </w:p>
-        </w:tc>
-        <w:tc>
-          <w:tcPr>
-            <w:tcW w:w="3120" w:type="dxa"/>
-            <w:tcBorders>
-              <w:top w:val="single" w:sz="1" w:space="0" w:color="CCCCCC"/>
-              <w:left w:val="single" w:sz="1" w:space="0" w:color="CCCCCC"/>
-              <w:bottom w:val="single" w:sz="1" w:space="0" w:color="CCCCCC"/>
-              <w:right w:val="single" w:sz="1" w:space="0" w:color="CCCCCC"/>
-            </w:tcBorders>
-            <w:shd w:val="clear" w:color="auto" w:fill="FFFFFF"/>
-            <w:tcMar>
-              <w:top w:w="80" w:type="dxa"/>
-              <w:left w:w="150" w:type="dxa"/>
-              <w:bottom w:w="80" w:type="dxa"/>
-              <w:right w:w="150" w:type="dxa"/>
-            </w:tcMar>
-          </w:tcPr>
-          <w:p>
-            <w:pPr>
-              <w:spacing w:line="276" w:lineRule="auto"/>
-              <w:contextualSpacing/>
-              <w:jc w:val="center"/>
-              <w:rPr>
-                <w:rFonts w:asciiTheme="majorHAnsi" w:hAnsiTheme="majorHAnsi" w:cstheme="majorHAnsi"/>
-                <w:sz w:val="28"/>
-                <w:szCs w:val="28"/>
-              </w:rPr>
-            </w:pPr>
-            <w:r>
-              <w:rPr>
-                <w:rFonts w:asciiTheme="majorHAnsi" w:hAnsiTheme="majorHAnsi" w:cstheme="majorHAnsi"/>
-                <w:sz w:val="28"/>
-                <w:szCs w:val="28"/>
-              </w:rPr>
-              <w:t>Tra cứu dữ liệu đã sắp xếp</w:t>
-            </w:r>
-          </w:p>
-        </w:tc>
-        <w:tc>
-          <w:tcPr>
-            <w:tcW w:w="3120" w:type="dxa"/>
-            <w:tcBorders>
-              <w:top w:val="single" w:sz="1" w:space="0" w:color="CCCCCC"/>
-              <w:left w:val="single" w:sz="1" w:space="0" w:color="CCCCCC"/>
-              <w:bottom w:val="single" w:sz="1" w:space="0" w:color="CCCCCC"/>
-              <w:right w:val="single" w:sz="1" w:space="0" w:color="CCCCCC"/>
-            </w:tcBorders>
-            <w:shd w:val="clear" w:color="auto" w:fill="FFFFFF"/>
-            <w:tcMar>
-              <w:top w:w="80" w:type="dxa"/>
-              <w:left w:w="150" w:type="dxa"/>
-              <w:bottom w:w="80" w:type="dxa"/>
-              <w:right w:w="150" w:type="dxa"/>
-            </w:tcMar>
-          </w:tcPr>
-          <w:p>
-            <w:pPr>
-              <w:spacing w:line="276" w:lineRule="auto"/>
-              <w:contextualSpacing/>
-              <w:jc w:val="center"/>
-              <w:rPr>
-                <w:rFonts w:asciiTheme="majorHAnsi" w:hAnsiTheme="majorHAnsi" w:cstheme="majorHAnsi"/>
-                <w:sz w:val="28"/>
-                <w:szCs w:val="28"/>
-              </w:rPr>
-            </w:pPr>
-            <w:r>
-              <w:rPr>
-                <w:rFonts w:asciiTheme="majorHAnsi" w:hAnsiTheme="majorHAnsi" w:cstheme="majorHAnsi"/>
-                <w:sz w:val="28"/>
-                <w:szCs w:val="28"/>
-              </w:rPr>
-              <w:t>Tìm kiếm dữ liệu bất kỳ</w:t>
-            </w:r>
-          </w:p>
-        </w:tc>
-      </w:tr>
-    </w:tbl>
-    <w:p>
-      <w:pPr>
-        <w:spacing w:line="276" w:lineRule="auto"/>
-        <w:contextualSpacing/>
-        <w:rPr>
-          <w:rFonts w:asciiTheme="majorHAnsi" w:hAnsiTheme="majorHAnsi" w:cstheme="majorHAnsi"/>
-          <w:sz w:val="28"/>
-          <w:szCs w:val="28"/>
-        </w:rPr>
-      </w:pPr>
-      <w:r>
-        <w:rPr>
-          <w:rFonts w:asciiTheme="majorHAnsi" w:hAnsiTheme="majorHAnsi" w:cstheme="majorHAnsi"/>
+    <w:p>
+      <w:pPr>
+        <w:spacing w:line="276" w:lineRule="auto"/>
+        <w:contextualSpacing/>
+        <w:rPr>
+          <w:rFonts w:asciiTheme="majorHAnsi" w:hAnsiTheme="majorHAnsi" w:cstheme="majorHAnsi"/>
+          <w:sz w:val="28"/>
+          <w:szCs w:val="28"/>
+        </w:rPr>
+      </w:pPr>
+      <w:r>
+        <w:rPr>
           <w:noProof/>
-          <w:sz w:val="28"/>
-          <w:szCs w:val="28"/>
         </w:rPr>
         <w:drawing>
-          <wp:inline distT="0" distB="0" distL="0" distR="0" wp14:anchorId="1DE03345" wp14:editId="78037EA5">
-            <wp:extent cx="6067703" cy="1365250"/>
-            <wp:effectExtent l="0" t="0" r="9525" b="6350"/>
-            <wp:docPr id="10" name="Picture 10"/>
+          <wp:inline distT="0" distB="0" distL="0" distR="0" wp14:anchorId="55B2CC54" wp14:editId="4755A442">
+            <wp:extent cx="4981575" cy="4248150"/>
+            <wp:effectExtent l="0" t="0" r="9525" b="0"/>
+            <wp:docPr id="5" name="Picture 5"/>
             <wp:cNvGraphicFramePr>
               <a:graphicFrameLocks xmlns:a="http://schemas.openxmlformats.org/drawingml/2006/main" noChangeAspect="1"/>
             </wp:cNvGraphicFramePr>
@@ -5031,7 +3464,7 @@
                   <pic:spPr>
                     <a:xfrm>
                       <a:off x="0" y="0"/>
-                      <a:ext cx="6073535" cy="1366562"/>
+                      <a:ext cx="4981575" cy="4248150"/>
                     </a:xfrm>
                     <a:prstGeom prst="rect">
                       <a:avLst/>
@@ -5055,18 +3488,6 @@
           <w:szCs w:val="28"/>
         </w:rPr>
       </w:pPr>
-    </w:p>
-    <w:p>
-      <w:pPr>
-        <w:spacing w:line="276" w:lineRule="auto"/>
-        <w:contextualSpacing/>
-        <w:jc w:val="center"/>
-        <w:rPr>
-          <w:rFonts w:asciiTheme="majorHAnsi" w:hAnsiTheme="majorHAnsi" w:cstheme="majorHAnsi"/>
-          <w:sz w:val="28"/>
-          <w:szCs w:val="28"/>
-        </w:rPr>
-      </w:pPr>
       <w:r>
         <w:rPr>
           <w:rFonts w:asciiTheme="majorHAnsi" w:hAnsiTheme="majorHAnsi" w:cstheme="majorHAnsi"/>
@@ -5074,6 +3495,7 @@
           <w:sz w:val="28"/>
           <w:szCs w:val="28"/>
         </w:rPr>
+        <w:lastRenderedPageBreak/>
         <w:t>Hình 5: Form thêm/sửa tài nguyên với upload ảnh</w:t>
       </w:r>
     </w:p>
@@ -5194,13 +3616,6 @@
         </w:rPr>
         <w:t>Xuất báo cáo: CSV UTF-8 chuẩn tiếng Việt, in phiếu mượn, in báo cáo.</w:t>
       </w:r>
-      <w:r>
-        <w:rPr>
-          <w:rFonts w:asciiTheme="majorHAnsi" w:hAnsiTheme="majorHAnsi" w:cstheme="majorHAnsi"/>
-          <w:sz w:val="28"/>
-          <w:szCs w:val="28"/>
-        </w:rPr>
-      </w:r>
     </w:p>
     <w:p>
       <w:pPr>
@@ -5215,17 +3630,13 @@
       </w:pPr>
       <w:r>
         <w:rPr>
-          <w:rFonts w:asciiTheme="majorHAnsi" w:hAnsiTheme="majorHAnsi" w:cstheme="majorHAnsi"/>
           <w:noProof/>
-          <w:sz w:val="28"/>
-          <w:szCs w:val="28"/>
-        </w:rPr>
-        <w:lastRenderedPageBreak/>
+        </w:rPr>
         <w:drawing>
-          <wp:inline distT="0" distB="0" distL="0" distR="0" wp14:anchorId="48899815" wp14:editId="7B541D97">
-            <wp:extent cx="5760085" cy="2585720"/>
-            <wp:effectExtent l="0" t="0" r="0" b="5080"/>
-            <wp:docPr id="11" name="Picture 11"/>
+          <wp:inline distT="0" distB="0" distL="0" distR="0" wp14:anchorId="20EDABD1" wp14:editId="2909BBB7">
+            <wp:extent cx="5760085" cy="4638040"/>
+            <wp:effectExtent l="0" t="0" r="0" b="0"/>
+            <wp:docPr id="6" name="Picture 6"/>
             <wp:cNvGraphicFramePr>
               <a:graphicFrameLocks xmlns:a="http://schemas.openxmlformats.org/drawingml/2006/main" noChangeAspect="1"/>
             </wp:cNvGraphicFramePr>
@@ -5245,7 +3656,7 @@
                   <pic:spPr>
                     <a:xfrm>
                       <a:off x="0" y="0"/>
-                      <a:ext cx="5760085" cy="2585720"/>
+                      <a:ext cx="5760085" cy="4638040"/>
                     </a:xfrm>
                     <a:prstGeom prst="rect">
                       <a:avLst/>
@@ -5328,21 +3739,11 @@
       <w:r>
         <w:rPr>
           <w:rFonts w:asciiTheme="majorHAnsi" w:hAnsiTheme="majorHAnsi" w:cstheme="majorHAnsi"/>
-          <w:b/>
-          <w:bCs/>
           <w:color w:val="000000"/>
           <w:sz w:val="28"/>
           <w:szCs w:val="28"/>
         </w:rPr>
         <w:t>Mở rộng quản lý: Thêm module quản lý thẻ bạn đọc, lịch sử mượn cá nhân.</w:t>
-      </w:r>
-      <w:r>
-        <w:rPr>
-          <w:rFonts w:asciiTheme="majorHAnsi" w:hAnsiTheme="majorHAnsi" w:cstheme="majorHAnsi"/>
-          <w:color w:val="000000"/>
-          <w:sz w:val="28"/>
-          <w:szCs w:val="28"/>
-        </w:rPr>
       </w:r>
     </w:p>
     <w:p>
@@ -5363,21 +3764,11 @@
       <w:r>
         <w:rPr>
           <w:rFonts w:asciiTheme="majorHAnsi" w:hAnsiTheme="majorHAnsi" w:cstheme="majorHAnsi"/>
-          <w:b/>
-          <w:bCs/>
           <w:color w:val="000000"/>
           <w:sz w:val="28"/>
           <w:szCs w:val="28"/>
         </w:rPr>
         <w:t>Thông báo đẩy: Gửi email/SMS nhắc nhở khi phiếu mượn sắp đến hạn trả.</w:t>
-      </w:r>
-      <w:r>
-        <w:rPr>
-          <w:rFonts w:asciiTheme="majorHAnsi" w:hAnsiTheme="majorHAnsi" w:cstheme="majorHAnsi"/>
-          <w:color w:val="000000"/>
-          <w:sz w:val="28"/>
-          <w:szCs w:val="28"/>
-        </w:rPr>
       </w:r>
     </w:p>
     <w:p>
@@ -5398,21 +3789,11 @@
       <w:r>
         <w:rPr>
           <w:rFonts w:asciiTheme="majorHAnsi" w:hAnsiTheme="majorHAnsi" w:cstheme="majorHAnsi"/>
-          <w:b/>
-          <w:bCs/>
           <w:color w:val="000000"/>
           <w:sz w:val="28"/>
           <w:szCs w:val="28"/>
         </w:rPr>
         <w:t>Mã QR: In mã QR trên sách, quét để tra cứu nhanh thông tin.</w:t>
-      </w:r>
-      <w:r>
-        <w:rPr>
-          <w:rFonts w:asciiTheme="majorHAnsi" w:hAnsiTheme="majorHAnsi" w:cstheme="majorHAnsi"/>
-          <w:color w:val="000000"/>
-          <w:sz w:val="28"/>
-          <w:szCs w:val="28"/>
-        </w:rPr>
       </w:r>
     </w:p>
     <w:p>
@@ -5433,29 +3814,11 @@
       <w:r>
         <w:rPr>
           <w:rFonts w:asciiTheme="majorHAnsi" w:hAnsiTheme="majorHAnsi" w:cstheme="majorHAnsi"/>
-          <w:b/>
-          <w:bCs/>
           <w:color w:val="000000"/>
           <w:sz w:val="28"/>
           <w:szCs w:val="28"/>
         </w:rPr>
         <w:t>Báo cáo nâng cao: Biểu đồ thống kê theo tháng/quý/năm, xuất PDF báo cáo.</w:t>
-      </w:r>
-      <w:r>
-        <w:rPr>
-          <w:rFonts w:asciiTheme="majorHAnsi" w:hAnsiTheme="majorHAnsi" w:cstheme="majorHAnsi"/>
-          <w:color w:val="000000"/>
-          <w:sz w:val="28"/>
-          <w:szCs w:val="28"/>
-        </w:rPr>
-      </w:r>
-      <w:r>
-        <w:rPr>
-          <w:rFonts w:asciiTheme="majorHAnsi" w:hAnsiTheme="majorHAnsi" w:cstheme="majorHAnsi"/>
-          <w:color w:val="000000"/>
-          <w:sz w:val="28"/>
-          <w:szCs w:val="28"/>
-        </w:rPr>
       </w:r>
     </w:p>
     <w:p>
@@ -5476,21 +3839,12 @@
       <w:r>
         <w:rPr>
           <w:rFonts w:asciiTheme="majorHAnsi" w:hAnsiTheme="majorHAnsi" w:cstheme="majorHAnsi"/>
-          <w:b/>
-          <w:bCs/>
           <w:color w:val="000000"/>
           <w:sz w:val="28"/>
           <w:szCs w:val="28"/>
         </w:rPr>
+        <w:lastRenderedPageBreak/>
         <w:t>Tích hợp CSDL quốc gia: Kết nối với hệ thống thư viện số quốc gia để tra cứu ISBN.</w:t>
-      </w:r>
-      <w:r>
-        <w:rPr>
-          <w:rFonts w:asciiTheme="majorHAnsi" w:hAnsiTheme="majorHAnsi" w:cstheme="majorHAnsi"/>
-          <w:color w:val="000000"/>
-          <w:sz w:val="28"/>
-          <w:szCs w:val="28"/>
-        </w:rPr>
       </w:r>
     </w:p>
     <w:p>
@@ -5544,6 +3898,18 @@
         </w:rPr>
         <w:t>Sản phẩm "Thư Viện Số THPT Hoàng Diệu" là một công cụ quản lý thư viện hiệu quả, hiện đại và dễ triển khai. Không cần máy chủ riêng, không cần cài đặt phần mềm — chỉ cần trình duyệt web là có thể truy cập từ bất kỳ đâu.</w:t>
       </w:r>
+    </w:p>
+    <w:p>
+      <w:pPr>
+        <w:spacing w:line="276" w:lineRule="auto"/>
+        <w:contextualSpacing/>
+        <w:jc w:val="both"/>
+        <w:rPr>
+          <w:rFonts w:asciiTheme="majorHAnsi" w:hAnsiTheme="majorHAnsi" w:cstheme="majorHAnsi"/>
+          <w:sz w:val="28"/>
+          <w:szCs w:val="28"/>
+        </w:rPr>
+      </w:pPr>
       <w:r>
         <w:rPr>
           <w:rFonts w:asciiTheme="majorHAnsi" w:hAnsiTheme="majorHAnsi" w:cstheme="majorHAnsi"/>
@@ -5551,6 +3917,7 @@
           <w:sz w:val="28"/>
           <w:szCs w:val="28"/>
         </w:rPr>
+        <w:t>Qua thực nghiệm tại trường, thủ thư và bạn đọc đều đánh giá cao tính tiện lợi của hệ thống. Thời gian xử lý phiếu mượn giảm đáng kể, tra cứu tài nguyên nhanh chóng, dữ liệu đồng bộ tức thì giữa nhiều thiết bị.</w:t>
       </w:r>
     </w:p>
     <w:p>
@@ -5571,44 +3938,7 @@
           <w:sz w:val="28"/>
           <w:szCs w:val="28"/>
         </w:rPr>
-        <w:t>Qua thực nghiệm tại trường, thủ thư và bạn đọc đều đánh giá cao tính tiện lợi của hệ thống. Thời gian xử lý phiếu mượn giảm đáng kể, tra cứu tài nguyên nhanh chóng, dữ liệu đồng bộ tức thì giữa nhiều thiết bị.</w:t>
-      </w:r>
-      <w:r>
-        <w:rPr>
-          <w:rFonts w:asciiTheme="majorHAnsi" w:hAnsiTheme="majorHAnsi" w:cstheme="majorHAnsi"/>
-          <w:color w:val="000000"/>
-          <w:sz w:val="28"/>
-          <w:szCs w:val="28"/>
-        </w:rPr>
-      </w:r>
-    </w:p>
-    <w:p>
-      <w:pPr>
-        <w:spacing w:line="276" w:lineRule="auto"/>
-        <w:contextualSpacing/>
-        <w:jc w:val="both"/>
-        <w:rPr>
-          <w:rFonts w:asciiTheme="majorHAnsi" w:hAnsiTheme="majorHAnsi" w:cstheme="majorHAnsi"/>
-          <w:sz w:val="28"/>
-          <w:szCs w:val="28"/>
-        </w:rPr>
-      </w:pPr>
-      <w:r>
-        <w:rPr>
-          <w:rFonts w:asciiTheme="majorHAnsi" w:hAnsiTheme="majorHAnsi" w:cstheme="majorHAnsi"/>
-          <w:color w:val="000000"/>
-          <w:sz w:val="28"/>
-          <w:szCs w:val="28"/>
-        </w:rPr>
         <w:t>Với giao diện teal tươi sáng, responsive, hỗ trợ dark mode, ứng dụng không chỉ là công cụ quản lý mà còn góp phần xây dựng hình ảnh thư viện trường học hiện đại, chuyên nghiệp trong thời đại chuyển đổi số.</w:t>
-      </w:r>
-      <w:r>
-        <w:rPr>
-          <w:rFonts w:asciiTheme="majorHAnsi" w:hAnsiTheme="majorHAnsi" w:cstheme="majorHAnsi"/>
-          <w:color w:val="000000"/>
-          <w:sz w:val="28"/>
-          <w:szCs w:val="28"/>
-        </w:rPr>
       </w:r>
     </w:p>
     <w:p>
@@ -5686,12 +4016,6 @@
         <w:gridCol w:w="6760"/>
       </w:tblGrid>
       <w:tr>
-        <w:tblPrEx>
-          <w:tblCellMar>
-            <w:top w:w="0" w:type="dxa"/>
-            <w:bottom w:w="0" w:type="dxa"/>
-          </w:tblCellMar>
-        </w:tblPrEx>
         <w:tc>
           <w:tcPr>
             <w:tcW w:w="2600" w:type="dxa"/>
@@ -5764,26 +4088,12 @@
                 <w:sz w:val="28"/>
                 <w:szCs w:val="28"/>
               </w:rPr>
-              <w:t>Trần Thị Kim Tho</w:t>
-            </w:r>
-            <w:r>
-              <w:rPr>
-                <w:rFonts w:asciiTheme="majorHAnsi" w:hAnsiTheme="majorHAnsi" w:cstheme="majorHAnsi"/>
-                <w:sz w:val="28"/>
-                <w:szCs w:val="28"/>
-              </w:rPr>
-              <w:t>a</w:t>
+              <w:t>Trần Thị Kim Thoa</w:t>
             </w:r>
           </w:p>
         </w:tc>
       </w:tr>
       <w:tr>
-        <w:tblPrEx>
-          <w:tblCellMar>
-            <w:top w:w="0" w:type="dxa"/>
-            <w:bottom w:w="0" w:type="dxa"/>
-          </w:tblCellMar>
-        </w:tblPrEx>
         <w:tc>
           <w:tcPr>
             <w:tcW w:w="2600" w:type="dxa"/>
@@ -5862,12 +4172,6 @@
         </w:tc>
       </w:tr>
       <w:tr>
-        <w:tblPrEx>
-          <w:tblCellMar>
-            <w:top w:w="0" w:type="dxa"/>
-            <w:bottom w:w="0" w:type="dxa"/>
-          </w:tblCellMar>
-        </w:tblPrEx>
         <w:tc>
           <w:tcPr>
             <w:tcW w:w="2600" w:type="dxa"/>
@@ -5946,12 +4250,6 @@
         </w:tc>
       </w:tr>
       <w:tr>
-        <w:tblPrEx>
-          <w:tblCellMar>
-            <w:top w:w="0" w:type="dxa"/>
-            <w:bottom w:w="0" w:type="dxa"/>
-          </w:tblCellMar>
-        </w:tblPrEx>
         <w:tc>
           <w:tcPr>
             <w:tcW w:w="2600" w:type="dxa"/>
@@ -6030,12 +4328,6 @@
         </w:tc>
       </w:tr>
       <w:tr>
-        <w:tblPrEx>
-          <w:tblCellMar>
-            <w:top w:w="0" w:type="dxa"/>
-            <w:bottom w:w="0" w:type="dxa"/>
-          </w:tblCellMar>
-        </w:tblPrEx>
         <w:tc>
           <w:tcPr>
             <w:tcW w:w="2600" w:type="dxa"/>
@@ -6114,12 +4406,6 @@
         </w:tc>
       </w:tr>
       <w:tr>
-        <w:tblPrEx>
-          <w:tblCellMar>
-            <w:top w:w="0" w:type="dxa"/>
-            <w:bottom w:w="0" w:type="dxa"/>
-          </w:tblCellMar>
-        </w:tblPrEx>
         <w:tc>
           <w:tcPr>
             <w:tcW w:w="2600" w:type="dxa"/>
@@ -6192,18 +4478,12 @@
                 <w:sz w:val="28"/>
                 <w:szCs w:val="28"/>
               </w:rPr>
-              <w:t>Mô Phỏng Tìm Kiếm 3D (Binary Search &amp; Sequential Search)</w:t>
+              <w:t>Thư Viện Số THPT Hoàng Diệu (Hệ thống Quản lý Tài nguyên &amp; Phiếu mượn)</w:t>
             </w:r>
           </w:p>
         </w:tc>
       </w:tr>
       <w:tr>
-        <w:tblPrEx>
-          <w:tblCellMar>
-            <w:top w:w="0" w:type="dxa"/>
-            <w:bottom w:w="0" w:type="dxa"/>
-          </w:tblCellMar>
-        </w:tblPrEx>
         <w:tc>
           <w:tcPr>
             <w:tcW w:w="2600" w:type="dxa"/>
@@ -6276,7 +4556,7 @@
                 <w:sz w:val="28"/>
                 <w:szCs w:val="28"/>
               </w:rPr>
-              <w:t>2025 – 2026</w:t>
+              <w:t>2026 – 2027</w:t>
             </w:r>
           </w:p>
         </w:tc>
@@ -6359,8 +4639,7 @@
       </w:r>
     </w:p>
     <w:sectPr>
-      <w:headerReference w:type="default" r:id="rId13"/>
-      <w:footerReference w:type="default" r:id="rId14"/>
+      <w:footerReference w:type="default" r:id="rId13"/>
       <w:pgSz w:w="11906" w:h="16838"/>
       <w:pgMar w:top="1418" w:right="1134" w:bottom="1134" w:left="1701" w:header="708" w:footer="708" w:gutter="0"/>
       <w:cols w:space="720"/>
@@ -6518,28 +4797,6 @@
     </w:p>
   </w:footnote>
 </w:footnotes>
-</file>
-
-<file path=word/header1.xml><?xml version="1.0" encoding="utf-8"?>
-<w:hdr xmlns:wpc="http://schemas.microsoft.com/office/word/2010/wordprocessingCanvas" xmlns:cx="http://schemas.microsoft.com/office/drawing/2014/chartex" xmlns:cx1="http://schemas.microsoft.com/office/drawing/2015/9/8/chartex" xmlns:cx2="http://schemas.microsoft.com/office/drawing/2015/10/21/chartex" xmlns:cx3="http://schemas.microsoft.com/office/drawing/2016/5/9/chartex" xmlns:cx4="http://schemas.microsoft.com/office/drawing/2016/5/10/chartex" xmlns:cx5="http://schemas.microsoft.com/office/drawing/2016/5/11/chartex" xmlns:cx6="http://schemas.microsoft.com/office/drawing/2016/5/12/chartex" xmlns:cx7="http://schemas.microsoft.com/office/drawing/2016/5/13/chartex" xmlns:cx8="http://schemas.microsoft.com/office/drawing/2016/5/14/chartex" xmlns:mc="http://schemas.openxmlformats.org/markup-compatibility/2006" xmlns:aink="http://schemas.microsoft.com/office/drawing/2016/ink" xmlns:am3d="http://schemas.microsoft.com/office/drawing/2017/model3d" xmlns:o="urn:schemas-microsoft-com:office:office" xmlns:r="http://schemas.openxmlformats.org/officeDocument/2006/relationships" xmlns:m="http://schemas.openxmlformats.org/officeDocument/2006/math" xmlns:v="urn:schemas-microsoft-com:vml" xmlns:wp14="http://schemas.microsoft.com/office/word/2010/wordprocessingDrawing" xmlns:wp="http://schemas.openxmlformats.org/drawingml/2006/wordprocessingDrawing" xmlns:w10="urn:schemas-microsoft-com:office:word" xmlns:w="http://schemas.openxmlformats.org/wordprocessingml/2006/main" xmlns:w14="http://schemas.microsoft.com/office/word/2010/wordml" xmlns:w15="http://schemas.microsoft.com/office/word/2012/wordml" xmlns:w16cex="http://schemas.microsoft.com/office/word/2018/wordml/cex" xmlns:w16cid="http://schemas.microsoft.com/office/word/2016/wordml/cid" xmlns:w16="http://schemas.microsoft.com/office/word/2018/wordml" xmlns:w16sdtdh="http://schemas.microsoft.com/office/word/2020/wordml/sdtdatahash" xmlns:w16se="http://schemas.microsoft.com/office/word/2015/wordml/symex" xmlns:wpg="http://schemas.microsoft.com/office/word/2010/wordprocessingGroup" xmlns:wpi="http://schemas.microsoft.com/office/word/2010/wordprocessingInk" xmlns:wne="http://schemas.microsoft.com/office/word/2006/wordml" xmlns:wps="http://schemas.microsoft.com/office/word/2010/wordprocessingShape" mc:Ignorable="w14 w15 w16se w16cid w16 w16cex w16sdtdh wp14">
-  <w:p>
-    <w:pPr>
-      <w:pBdr>
-        <w:bottom w:val="single" w:sz="4" w:space="1" w:color="2E74B5"/>
-      </w:pBdr>
-      <w:spacing w:after="80"/>
-      <w:jc w:val="right"/>
-    </w:pPr>
-    <w:r>
-      <w:rPr>
-        <w:color w:val="595959"/>
-        <w:sz w:val="18"/>
-        <w:szCs w:val="18"/>
-      </w:rPr>
-      <w:t>Báo cáo sản phẩm: Mô Phỏng Tìm Kiếm 3D</w:t>
-    </w:r>
-  </w:p>
-</w:hdr>
 </file>
 
 <file path=word/numbering.xml><?xml version="1.0" encoding="utf-8"?>
@@ -7354,6 +5611,48 @@
       <w:szCs w:val="20"/>
     </w:rPr>
   </w:style>
+  <w:style w:type="paragraph" w:styleId="Header">
+    <w:name w:val="header"/>
+    <w:basedOn w:val="Normal"/>
+    <w:link w:val="HeaderChar"/>
+    <w:uiPriority w:val="99"/>
+    <w:unhideWhenUsed/>
+    <w:rsid w:val="003D1C45"/>
+    <w:pPr>
+      <w:tabs>
+        <w:tab w:val="center" w:pos="4513"/>
+        <w:tab w:val="right" w:pos="9026"/>
+      </w:tabs>
+    </w:pPr>
+  </w:style>
+  <w:style w:type="character" w:customStyle="1" w:styleId="HeaderChar">
+    <w:name w:val="Header Char"/>
+    <w:basedOn w:val="DefaultParagraphFont"/>
+    <w:link w:val="Header"/>
+    <w:uiPriority w:val="99"/>
+    <w:rsid w:val="003D1C45"/>
+  </w:style>
+  <w:style w:type="paragraph" w:styleId="Footer">
+    <w:name w:val="footer"/>
+    <w:basedOn w:val="Normal"/>
+    <w:link w:val="FooterChar"/>
+    <w:uiPriority w:val="99"/>
+    <w:unhideWhenUsed/>
+    <w:rsid w:val="003D1C45"/>
+    <w:pPr>
+      <w:tabs>
+        <w:tab w:val="center" w:pos="4513"/>
+        <w:tab w:val="right" w:pos="9026"/>
+      </w:tabs>
+    </w:pPr>
+  </w:style>
+  <w:style w:type="character" w:customStyle="1" w:styleId="FooterChar">
+    <w:name w:val="Footer Char"/>
+    <w:basedOn w:val="DefaultParagraphFont"/>
+    <w:link w:val="Footer"/>
+    <w:uiPriority w:val="99"/>
+    <w:rsid w:val="003D1C45"/>
+  </w:style>
 </w:styles>
 </file>
 

</xml_diff>